<commit_message>
KEP task for the documentation is finished, MDÖ may continue
</commit_message>
<xml_diff>
--- a/Dokumentation und Berechnung/Awesome_Gripper.docx
+++ b/Dokumentation und Berechnung/Awesome_Gripper.docx
@@ -126,7 +126,7 @@
       <w:r>
         <w:fldChar w:fldCharType="separate"/>
       </w:r>
-      <w:hyperlink w:anchor="_Toc189674377" w:history="1">
+      <w:hyperlink w:anchor="_Toc190272635" w:history="1">
         <w:r>
           <w:rPr>
             <w:rStyle w:val="Hyperlink"/>
@@ -153,7 +153,7 @@
             <w:noProof/>
             <w:webHidden/>
           </w:rPr>
-          <w:instrText xml:space="preserve"> PAGEREF _Toc189674377 \h </w:instrText>
+          <w:instrText xml:space="preserve"> PAGEREF _Toc190272635 \h </w:instrText>
         </w:r>
         <w:r>
           <w:rPr>
@@ -197,7 +197,7 @@
           <w14:ligatures w14:val="standardContextual"/>
         </w:rPr>
       </w:pPr>
-      <w:hyperlink w:anchor="_Toc189674378" w:history="1">
+      <w:hyperlink w:anchor="_Toc190272636" w:history="1">
         <w:r>
           <w:rPr>
             <w:rStyle w:val="Hyperlink"/>
@@ -224,7 +224,7 @@
             <w:noProof/>
             <w:webHidden/>
           </w:rPr>
-          <w:instrText xml:space="preserve"> PAGEREF _Toc189674378 \h </w:instrText>
+          <w:instrText xml:space="preserve"> PAGEREF _Toc190272636 \h </w:instrText>
         </w:r>
         <w:r>
           <w:rPr>
@@ -268,7 +268,7 @@
           <w14:ligatures w14:val="standardContextual"/>
         </w:rPr>
       </w:pPr>
-      <w:hyperlink w:anchor="_Toc189674379" w:history="1">
+      <w:hyperlink w:anchor="_Toc190272637" w:history="1">
         <w:r>
           <w:rPr>
             <w:rStyle w:val="Hyperlink"/>
@@ -295,7 +295,7 @@
             <w:noProof/>
             <w:webHidden/>
           </w:rPr>
-          <w:instrText xml:space="preserve"> PAGEREF _Toc189674379 \h </w:instrText>
+          <w:instrText xml:space="preserve"> PAGEREF _Toc190272637 \h </w:instrText>
         </w:r>
         <w:r>
           <w:rPr>
@@ -339,7 +339,7 @@
           <w14:ligatures w14:val="standardContextual"/>
         </w:rPr>
       </w:pPr>
-      <w:hyperlink w:anchor="_Toc189674380" w:history="1">
+      <w:hyperlink w:anchor="_Toc190272638" w:history="1">
         <w:r>
           <w:rPr>
             <w:rStyle w:val="Hyperlink"/>
@@ -366,7 +366,7 @@
             <w:noProof/>
             <w:webHidden/>
           </w:rPr>
-          <w:instrText xml:space="preserve"> PAGEREF _Toc189674380 \h </w:instrText>
+          <w:instrText xml:space="preserve"> PAGEREF _Toc190272638 \h </w:instrText>
         </w:r>
         <w:r>
           <w:rPr>
@@ -386,7 +386,7 @@
             <w:noProof/>
             <w:webHidden/>
           </w:rPr>
-          <w:t>6</w:t>
+          <w:t>9</w:t>
         </w:r>
         <w:r>
           <w:rPr>
@@ -410,7 +410,7 @@
           <w14:ligatures w14:val="standardContextual"/>
         </w:rPr>
       </w:pPr>
-      <w:hyperlink w:anchor="_Toc189674381" w:history="1">
+      <w:hyperlink w:anchor="_Toc190272639" w:history="1">
         <w:r>
           <w:rPr>
             <w:rStyle w:val="Hyperlink"/>
@@ -437,7 +437,7 @@
             <w:noProof/>
             <w:webHidden/>
           </w:rPr>
-          <w:instrText xml:space="preserve"> PAGEREF _Toc189674381 \h </w:instrText>
+          <w:instrText xml:space="preserve"> PAGEREF _Toc190272639 \h </w:instrText>
         </w:r>
         <w:r>
           <w:rPr>
@@ -457,7 +457,7 @@
             <w:noProof/>
             <w:webHidden/>
           </w:rPr>
-          <w:t>6</w:t>
+          <w:t>10</w:t>
         </w:r>
         <w:r>
           <w:rPr>
@@ -481,7 +481,7 @@
           <w14:ligatures w14:val="standardContextual"/>
         </w:rPr>
       </w:pPr>
-      <w:hyperlink w:anchor="_Toc189674382" w:history="1">
+      <w:hyperlink w:anchor="_Toc190272640" w:history="1">
         <w:r>
           <w:rPr>
             <w:rStyle w:val="Hyperlink"/>
@@ -508,7 +508,7 @@
             <w:noProof/>
             <w:webHidden/>
           </w:rPr>
-          <w:instrText xml:space="preserve"> PAGEREF _Toc189674382 \h </w:instrText>
+          <w:instrText xml:space="preserve"> PAGEREF _Toc190272640 \h </w:instrText>
         </w:r>
         <w:r>
           <w:rPr>
@@ -528,7 +528,7 @@
             <w:noProof/>
             <w:webHidden/>
           </w:rPr>
-          <w:t>6</w:t>
+          <w:t>10</w:t>
         </w:r>
         <w:r>
           <w:rPr>
@@ -552,7 +552,7 @@
           <w14:ligatures w14:val="standardContextual"/>
         </w:rPr>
       </w:pPr>
-      <w:hyperlink w:anchor="_Toc189674383" w:history="1">
+      <w:hyperlink w:anchor="_Toc190272641" w:history="1">
         <w:r>
           <w:rPr>
             <w:rStyle w:val="Hyperlink"/>
@@ -580,7 +580,7 @@
             <w:noProof/>
             <w:webHidden/>
           </w:rPr>
-          <w:instrText xml:space="preserve"> PAGEREF _Toc189674383 \h </w:instrText>
+          <w:instrText xml:space="preserve"> PAGEREF _Toc190272641 \h </w:instrText>
         </w:r>
         <w:r>
           <w:rPr>
@@ -600,7 +600,7 @@
             <w:noProof/>
             <w:webHidden/>
           </w:rPr>
-          <w:t>8</w:t>
+          <w:t>12</w:t>
         </w:r>
         <w:r>
           <w:rPr>
@@ -626,7 +626,7 @@
       <w:pPr>
         <w:pStyle w:val="berschrift1"/>
       </w:pPr>
-      <w:bookmarkStart w:id="1" w:name="_Toc189674377"/>
+      <w:bookmarkStart w:id="1" w:name="_Toc190272635"/>
       <w:r>
         <w:lastRenderedPageBreak/>
         <w:t>Greif-Aufgabenstellung</w:t>
@@ -716,6 +716,7 @@
         </w:rPr>
       </w:pPr>
       <w:bookmarkStart w:id="2" w:name="_Ref189671489"/>
+      <w:bookmarkStart w:id="3" w:name="_Toc190271938"/>
       <w:r>
         <w:rPr>
           <w:lang w:val="de-AT"/>
@@ -751,6 +752,7 @@
         </w:rPr>
         <w:t>: Werkstück</w:t>
       </w:r>
+      <w:bookmarkEnd w:id="3"/>
     </w:p>
     <w:p>
       <w:pPr>
@@ -781,7 +783,7 @@
         <w:fldChar w:fldCharType="end"/>
       </w:r>
       <w:r>
-        <w:t xml:space="preserve"> ist die Anlage veranschaulicht. Die bearbeiteten Werkstücke kommen mittels einem Gurt-Förderband, welche auf dem Förderband durch einen Seitenanschlag positioniert werden. Die endgültige Position längs in Fahrtrichtung des Förderbandes, wird durch eine 2D-Kamera ermittelt, sodass der Roboter variabel die Werkstücke aufnehmen kann. Die Taktzeit beträgt 5 s vom Zeitpunkt der Entnahme des Werkstückes bis zur nächsten Entnahme des Werkstückes. Aus Taktzeitgründen, wird vorgesehen, dass ein Leichtbau Manipulator auf einer linear Schiene verfahrbar ist, um Werkstücke bereits am Anfang des Förderbandes zu entnehmen. Dies ermöglicht es, vorübergehend einen Zeitpuffer aufzubauen.</w:t>
+        <w:t xml:space="preserve"> ist die Anlage veranschaulicht. Die bearbeiteten Werkstücke kommen mittels einem Gurt-Förderband, welche durch einen Seitenanschlag positioniert werden. Die endgültige Position längs in Fahrtrichtung des Förderbandes, wird durch eine 2D-Kamera ermittelt, sodass der Roboter variabel die Werkstücke aufnehmen kann. Die Taktzeit beträgt 5 s vom Zeitpunkt der Entnahme des Werkstückes bis zur nächsten Entnahme des Werkstückes. Aus Taktzeitgründen, wird vorgesehen, dass ein Leichtbau Manipulator auf einer linear Schiene verfahrbar ist, um Werkstücke bereits am Anfang des Förderbandes zu entnehmen. Dies ermöglicht es, vorübergehend einen Zeitpuffer aufzubauen.</w:t>
       </w:r>
     </w:p>
     <w:p>
@@ -789,6 +791,9 @@
         <w:keepNext/>
       </w:pPr>
       <w:r>
+        <w:rPr>
+          <w:noProof/>
+        </w:rPr>
         <w:drawing>
           <wp:inline distT="0" distB="0" distL="0" distR="0" wp14:anchorId="3C90C059" wp14:editId="192B854D">
             <wp:extent cx="3226280" cy="2443934"/>
@@ -833,7 +838,8 @@
           <w:lang w:val="de-AT"/>
         </w:rPr>
       </w:pPr>
-      <w:bookmarkStart w:id="3" w:name="_Ref189671919"/>
+      <w:bookmarkStart w:id="4" w:name="_Ref189671919"/>
+      <w:bookmarkStart w:id="5" w:name="_Toc190271939"/>
       <w:r>
         <w:rPr>
           <w:lang w:val="de-AT"/>
@@ -862,13 +868,14 @@
       <w:r>
         <w:fldChar w:fldCharType="end"/>
       </w:r>
-      <w:bookmarkEnd w:id="3"/>
+      <w:bookmarkEnd w:id="4"/>
       <w:r>
         <w:rPr>
           <w:lang w:val="de-AT"/>
         </w:rPr>
         <w:t>: Anlagen Skizze</w:t>
       </w:r>
+      <w:bookmarkEnd w:id="5"/>
     </w:p>
     <w:p>
       <w:pPr>
@@ -908,6 +915,9 @@
         <w:keepNext/>
       </w:pPr>
       <w:r>
+        <w:rPr>
+          <w:noProof/>
+        </w:rPr>
         <w:drawing>
           <wp:inline distT="0" distB="0" distL="0" distR="0" wp14:anchorId="6BD4FC36" wp14:editId="0D67AF7A">
             <wp:extent cx="6300470" cy="1801495"/>
@@ -952,7 +962,8 @@
           <w:lang w:val="de-AT"/>
         </w:rPr>
       </w:pPr>
-      <w:bookmarkStart w:id="4" w:name="_Ref189672543"/>
+      <w:bookmarkStart w:id="6" w:name="_Ref189672543"/>
+      <w:bookmarkStart w:id="7" w:name="_Toc190271940"/>
       <w:r>
         <w:rPr>
           <w:lang w:val="de-AT"/>
@@ -981,7 +992,7 @@
       <w:r>
         <w:fldChar w:fldCharType="end"/>
       </w:r>
-      <w:bookmarkEnd w:id="4"/>
+      <w:bookmarkEnd w:id="6"/>
       <w:r>
         <w:rPr>
           <w:lang w:val="de-AT"/>
@@ -1006,16 +1017,17 @@
         </w:rPr>
         <w:t>uführung | Links Abführung)</w:t>
       </w:r>
+      <w:bookmarkEnd w:id="7"/>
     </w:p>
     <w:p>
       <w:pPr>
         <w:pStyle w:val="berschrift1"/>
       </w:pPr>
-      <w:bookmarkStart w:id="5" w:name="_Toc189674378"/>
+      <w:bookmarkStart w:id="8" w:name="_Toc190272636"/>
       <w:r>
         <w:t>Konstruktives Schema</w:t>
       </w:r>
-      <w:bookmarkEnd w:id="5"/>
+      <w:bookmarkEnd w:id="8"/>
     </w:p>
     <w:p>
       <w:r>
@@ -1035,10 +1047,7 @@
     </w:p>
     <w:p>
       <w:r>
-        <w:t xml:space="preserve">- </w:t>
-      </w:r>
-      <w:r>
-        <w:t>Greif Merkmale</w:t>
+        <w:t>- Greif Merkmale</w:t>
       </w:r>
       <w:r>
         <w:br/>
@@ -1167,6 +1176,9 @@
         <w:keepNext/>
       </w:pPr>
       <w:r>
+        <w:rPr>
+          <w:noProof/>
+        </w:rPr>
         <w:lastRenderedPageBreak/>
         <w:drawing>
           <wp:inline distT="0" distB="0" distL="0" distR="0" wp14:anchorId="742FA4FE" wp14:editId="6E25040F">
@@ -1225,7 +1237,8 @@
           <w:lang w:val="de-AT"/>
         </w:rPr>
       </w:pPr>
-      <w:bookmarkStart w:id="6" w:name="_Ref189674488"/>
+      <w:bookmarkStart w:id="9" w:name="_Ref189674488"/>
+      <w:bookmarkStart w:id="10" w:name="_Toc190271941"/>
       <w:r>
         <w:rPr>
           <w:lang w:val="de-AT"/>
@@ -1254,13 +1267,14 @@
       <w:r>
         <w:fldChar w:fldCharType="end"/>
       </w:r>
-      <w:bookmarkEnd w:id="6"/>
+      <w:bookmarkEnd w:id="9"/>
       <w:r>
         <w:rPr>
           <w:lang w:val="de-AT"/>
         </w:rPr>
         <w:t>: Schematische Skizze des Parallelbackengreifers</w:t>
       </w:r>
+      <w:bookmarkEnd w:id="10"/>
     </w:p>
     <w:p>
       <w:r>
@@ -1317,6 +1331,9 @@
         <w:keepNext/>
       </w:pPr>
       <w:r>
+        <w:rPr>
+          <w:noProof/>
+        </w:rPr>
         <w:lastRenderedPageBreak/>
         <w:drawing>
           <wp:inline distT="0" distB="0" distL="0" distR="0" wp14:anchorId="6F00894F" wp14:editId="6EE5F050">
@@ -1375,7 +1392,8 @@
           <w:lang w:val="de-AT"/>
         </w:rPr>
       </w:pPr>
-      <w:bookmarkStart w:id="7" w:name="_Ref189675952"/>
+      <w:bookmarkStart w:id="11" w:name="_Ref189675952"/>
+      <w:bookmarkStart w:id="12" w:name="_Toc190271942"/>
       <w:r>
         <w:rPr>
           <w:lang w:val="de-AT"/>
@@ -1404,7 +1422,7 @@
       <w:r>
         <w:fldChar w:fldCharType="end"/>
       </w:r>
-      <w:bookmarkEnd w:id="7"/>
+      <w:bookmarkEnd w:id="11"/>
       <w:r>
         <w:rPr>
           <w:lang w:val="de-AT"/>
@@ -1423,6 +1441,7 @@
         </w:rPr>
         <w:t xml:space="preserve"> Greifers</w:t>
       </w:r>
+      <w:bookmarkEnd w:id="12"/>
     </w:p>
     <w:p/>
     <w:p>
@@ -1471,11 +1490,11 @@
       <w:pPr>
         <w:pStyle w:val="berschrift1"/>
       </w:pPr>
-      <w:bookmarkStart w:id="8" w:name="_Toc189674379"/>
+      <w:bookmarkStart w:id="13" w:name="_Toc190272637"/>
       <w:r>
         <w:t>Greifkraft und Antrieb Berechnung</w:t>
       </w:r>
-      <w:bookmarkEnd w:id="8"/>
+      <w:bookmarkEnd w:id="13"/>
     </w:p>
     <w:p>
       <w:pPr>
@@ -1489,21 +1508,7 @@
           <w:b/>
           <w:bCs/>
         </w:rPr>
-        <w:t xml:space="preserve">Randbedingungen </w:t>
-      </w:r>
-      <w:r>
-        <w:rPr>
-          <w:b/>
-          <w:bCs/>
-        </w:rPr>
-        <w:t>für die Greifkraft Berechnung</w:t>
-      </w:r>
-      <w:r>
-        <w:rPr>
-          <w:b/>
-          <w:bCs/>
-        </w:rPr>
-        <w:t>:</w:t>
+        <w:t>Randbedingungen für die Greifkraft Berechnung:</w:t>
       </w:r>
     </w:p>
     <w:p>
@@ -1535,8 +1540,13 @@
           <w:numId w:val="13"/>
         </w:numPr>
       </w:pPr>
-      <w:r>
-        <w:t>Taktzeit = 5 s</w:t>
+      <w:proofErr w:type="spellStart"/>
+      <w:r>
+        <w:t>Taktzeit</w:t>
+      </w:r>
+      <w:proofErr w:type="spellEnd"/>
+      <w:r>
+        <w:t xml:space="preserve"> = 5 s</w:t>
       </w:r>
     </w:p>
     <w:p>
@@ -1722,8 +1732,16 @@
     </w:p>
     <w:p>
       <w:r>
-        <w:t>Zur vereinfachten Berechnung der maximalen Beschleunigung beim Anheben des Werkstücks wird angenommen, dass die Geschwindigkeit zu Beginn v=0</w:t>
-      </w:r>
+        <w:t xml:space="preserve">Zur vereinfachten Berechnung der maximalen Beschleunigung beim Anheben des Werkstücks wird angenommen, dass die Geschwindigkeit zu Beginn </w:t>
+      </w:r>
+      <m:oMath>
+        <m:r>
+          <w:rPr>
+            <w:rFonts w:ascii="Cambria Math" w:hAnsi="Cambria Math"/>
+          </w:rPr>
+          <m:t>v=0</m:t>
+        </m:r>
+      </m:oMath>
       <w:r>
         <w:t xml:space="preserve"> </w:t>
       </w:r>
@@ -1733,11 +1751,16 @@
     </w:p>
     <w:p>
       <w:r>
-        <w:t xml:space="preserve">Mithilfe der allgemeinen Bewegungsgleichung wird die Beschleunigung </w:t>
-      </w:r>
-      <w:r>
-        <w:t>a</w:t>
-      </w:r>
+        <w:t>Mithilfe der allgemeinen Bewegungsgleichung wird die Beschleunigung</w:t>
+      </w:r>
+      <m:oMath>
+        <m:r>
+          <w:rPr>
+            <w:rFonts w:ascii="Cambria Math" w:hAnsi="Cambria Math"/>
+          </w:rPr>
+          <m:t xml:space="preserve"> a</m:t>
+        </m:r>
+      </m:oMath>
       <w:r>
         <w:t xml:space="preserve"> hergeleitet. Da sowohl die Zeit, zu der die maximale Beschleunigung auftritt, als auch der maximale Abstand bekannt sind, kann die Beschleunigung direkt berechnet werden.</w:t>
       </w:r>
@@ -1910,7 +1933,8 @@
           <w:lang w:val="de-AT"/>
         </w:rPr>
       </w:pPr>
-      <w:bookmarkStart w:id="9" w:name="_Ref189679923"/>
+      <w:bookmarkStart w:id="14" w:name="_Ref189679923"/>
+      <w:bookmarkStart w:id="15" w:name="_Toc190271943"/>
       <w:r>
         <w:rPr>
           <w:lang w:val="de-AT"/>
@@ -1939,7 +1963,7 @@
       <w:r>
         <w:fldChar w:fldCharType="end"/>
       </w:r>
-      <w:bookmarkEnd w:id="9"/>
+      <w:bookmarkEnd w:id="14"/>
       <w:r>
         <w:rPr>
           <w:lang w:val="de-AT"/>
@@ -1958,13 +1982,46 @@
         </w:rPr>
         <w:t xml:space="preserve"> h-Strecken Methode</w:t>
       </w:r>
-    </w:p>
-    <w:p>
-      <w:r>
-        <w:t xml:space="preserve">Es wurde ein Servo DC-Motor mit einem Drehmoment von 20 kgcm bzw. 1.96 Nm vorgesehen. </w:t>
-      </w:r>
-      <w:r>
-        <w:t>Aus dem notwendigen Moment und dem Drehmoment des Servo Motors, ergibt sich eine Sicherheit von über 2.5.</w:t>
+      <w:bookmarkEnd w:id="15"/>
+    </w:p>
+    <w:p>
+      <w:r>
+        <w:t xml:space="preserve">Es wurde ein </w:t>
+      </w:r>
+      <w:proofErr w:type="spellStart"/>
+      <w:r>
+        <w:t>Servo</w:t>
+      </w:r>
+      <w:proofErr w:type="spellEnd"/>
+      <w:r>
+        <w:t xml:space="preserve"> DC-Motor mit einem Drehmoment von 20 </w:t>
+      </w:r>
+      <w:proofErr w:type="spellStart"/>
+      <w:r>
+        <w:t>kgcm</w:t>
+      </w:r>
+      <w:proofErr w:type="spellEnd"/>
+      <w:r>
+        <w:t xml:space="preserve"> bzw. 1.96 </w:t>
+      </w:r>
+      <w:proofErr w:type="spellStart"/>
+      <w:r>
+        <w:t>Nm</w:t>
+      </w:r>
+      <w:proofErr w:type="spellEnd"/>
+      <w:r>
+        <w:t xml:space="preserve"> vorgesehen. </w:t>
+      </w:r>
+      <w:r>
+        <w:t xml:space="preserve">Aus dem notwendigen Moment und dem Drehmoment des </w:t>
+      </w:r>
+      <w:proofErr w:type="spellStart"/>
+      <w:r>
+        <w:t>Servo</w:t>
+      </w:r>
+      <w:proofErr w:type="spellEnd"/>
+      <w:r>
+        <w:t xml:space="preserve"> Motors, ergibt sich eine Sicherheit von über 2.5.</w:t>
       </w:r>
     </w:p>
     <w:p/>
@@ -1972,50 +2029,324 @@
       <w:pPr>
         <w:pStyle w:val="berschrift1"/>
       </w:pPr>
-      <w:bookmarkStart w:id="10" w:name="_Toc189674380"/>
+      <w:bookmarkStart w:id="16" w:name="_Toc190272638"/>
       <w:r>
         <w:lastRenderedPageBreak/>
         <w:t>Analytische und Numerische Auslegung</w:t>
       </w:r>
-      <w:bookmarkEnd w:id="10"/>
+      <w:bookmarkEnd w:id="16"/>
+    </w:p>
+    <w:p>
+      <w:pPr>
+        <w:keepNext/>
+      </w:pPr>
+      <w:r>
+        <w:t xml:space="preserve">Es wurde eine analytische Festigkeitsberechnung für </w:t>
+      </w:r>
+      <w:r>
+        <w:t xml:space="preserve">Glieder 2 und 7 berechnet (siehe </w:t>
+      </w:r>
+      <w:r>
+        <w:fldChar w:fldCharType="begin"/>
+      </w:r>
+      <w:r>
+        <w:instrText xml:space="preserve"> REF _Ref189674488 \h </w:instrText>
+      </w:r>
+      <w:r>
+        <w:fldChar w:fldCharType="separate"/>
+      </w:r>
+      <w:r>
+        <w:t xml:space="preserve">Abbildung </w:t>
+      </w:r>
+      <w:r>
+        <w:rPr>
+          <w:noProof/>
+        </w:rPr>
+        <w:t>4</w:t>
+      </w:r>
+      <w:r>
+        <w:fldChar w:fldCharType="end"/>
+      </w:r>
+      <w:r>
+        <w:t xml:space="preserve">), da es durch den vorgesehenen Design Material Ersparnis, aufgrund der kleinen Fläche zur höchsten Spannung führen könnte. Die Zugspannung lässt sich geometrisch ableiten (siehe </w:t>
+      </w:r>
+      <w:r>
+        <w:fldChar w:fldCharType="begin"/>
+      </w:r>
+      <w:r>
+        <w:instrText xml:space="preserve"> REF _Ref190270853 \h </w:instrText>
+      </w:r>
+      <w:r>
+        <w:fldChar w:fldCharType="separate"/>
+      </w:r>
+      <w:r>
+        <w:t xml:space="preserve">Abbildung </w:t>
+      </w:r>
+      <w:r>
+        <w:rPr>
+          <w:noProof/>
+        </w:rPr>
+        <w:t>7</w:t>
+      </w:r>
+      <w:r>
+        <w:fldChar w:fldCharType="end"/>
+      </w:r>
+      <w:r>
+        <w:t>)</w:t>
+      </w:r>
+      <w:r>
+        <w:t xml:space="preserve">, </w:t>
+      </w:r>
+      <w:r>
+        <w:t>indem die am Punkt A wirkende Kraft in ihre Längs- und Querkomponenten zerlegt wird.</w:t>
+      </w:r>
+      <w:r>
+        <w:br/>
+      </w:r>
+      <w:r>
+        <w:br/>
+      </w:r>
+      <w:r>
+        <w:drawing>
+          <wp:inline distT="0" distB="0" distL="0" distR="0" wp14:anchorId="5B399ED9" wp14:editId="49D45B78">
+            <wp:extent cx="6300470" cy="5810250"/>
+            <wp:effectExtent l="0" t="0" r="5080" b="0"/>
+            <wp:docPr id="1305173566" name="Grafik 1" descr="Ein Bild, das Diagramm, Design enthält.&#10;&#10;KI-generierte Inhalte können fehlerhaft sein."/>
+            <wp:cNvGraphicFramePr>
+              <a:graphicFrameLocks xmlns:a="http://schemas.openxmlformats.org/drawingml/2006/main" noChangeAspect="1"/>
+            </wp:cNvGraphicFramePr>
+            <a:graphic xmlns:a="http://schemas.openxmlformats.org/drawingml/2006/main">
+              <a:graphicData uri="http://schemas.openxmlformats.org/drawingml/2006/picture">
+                <pic:pic xmlns:pic="http://schemas.openxmlformats.org/drawingml/2006/picture">
+                  <pic:nvPicPr>
+                    <pic:cNvPr id="1305173566" name="Grafik 1" descr="Ein Bild, das Diagramm, Design enthält.&#10;&#10;KI-generierte Inhalte können fehlerhaft sein."/>
+                    <pic:cNvPicPr/>
+                  </pic:nvPicPr>
+                  <pic:blipFill>
+                    <a:blip r:embed="rId18"/>
+                    <a:stretch>
+                      <a:fillRect/>
+                    </a:stretch>
+                  </pic:blipFill>
+                  <pic:spPr>
+                    <a:xfrm>
+                      <a:off x="0" y="0"/>
+                      <a:ext cx="6300470" cy="5810250"/>
+                    </a:xfrm>
+                    <a:prstGeom prst="rect">
+                      <a:avLst/>
+                    </a:prstGeom>
+                  </pic:spPr>
+                </pic:pic>
+              </a:graphicData>
+            </a:graphic>
+          </wp:inline>
+        </w:drawing>
+      </w:r>
+    </w:p>
+    <w:p>
+      <w:pPr>
+        <w:pStyle w:val="Beschriftung"/>
+        <w:rPr>
+          <w:lang w:val="de-AT"/>
+        </w:rPr>
+      </w:pPr>
+      <w:bookmarkStart w:id="17" w:name="_Ref190270853"/>
+      <w:bookmarkStart w:id="18" w:name="_Toc190271944"/>
+      <w:r>
+        <w:rPr>
+          <w:lang w:val="de-AT"/>
+        </w:rPr>
+        <w:t xml:space="preserve">Abbildung </w:t>
+      </w:r>
+      <w:r>
+        <w:fldChar w:fldCharType="begin"/>
+      </w:r>
+      <w:r>
+        <w:rPr>
+          <w:lang w:val="de-AT"/>
+        </w:rPr>
+        <w:instrText xml:space="preserve"> SEQ Abbildung \* ARABIC </w:instrText>
+      </w:r>
+      <w:r>
+        <w:fldChar w:fldCharType="separate"/>
+      </w:r>
+      <w:r>
+        <w:rPr>
+          <w:noProof/>
+          <w:lang w:val="de-AT"/>
+        </w:rPr>
+        <w:t>7</w:t>
+      </w:r>
+      <w:r>
+        <w:fldChar w:fldCharType="end"/>
+      </w:r>
+      <w:bookmarkEnd w:id="17"/>
+      <w:r>
+        <w:rPr>
+          <w:lang w:val="de-AT"/>
+        </w:rPr>
+        <w:t>: Geometrische Herleitung der Zugspannung auf das 2 und 7 Glied des Endeffektors</w:t>
+      </w:r>
+      <w:bookmarkEnd w:id="18"/>
+    </w:p>
+    <w:p>
+      <w:r>
+        <w:t>Mittels des Querschnittes</w:t>
+      </w:r>
+      <w:r>
+        <w:t xml:space="preserve"> des Bauteils, welches mittels </w:t>
+      </w:r>
+      <w:r>
+        <w:t>SolidWorks</w:t>
+      </w:r>
+      <w:r>
+        <w:t xml:space="preserve"> ermittelt wurde, kann die Spannung in folgender Gleichung berechnet werden.</w:t>
+      </w:r>
     </w:p>
     <w:p/>
     <w:p>
+      <w:r>
+        <w:rPr>
+          <w:noProof/>
+        </w:rPr>
+        <w:drawing>
+          <wp:inline distT="0" distB="0" distL="0" distR="0" wp14:anchorId="54FAABBE" wp14:editId="13887A36">
+            <wp:extent cx="3571336" cy="1756395"/>
+            <wp:effectExtent l="0" t="0" r="0" b="0"/>
+            <wp:docPr id="497494484" name="Grafik 1" descr="Ein Bild, das Text, Schrift, Screenshot, Reihe enthält.&#10;&#10;KI-generierte Inhalte können fehlerhaft sein."/>
+            <wp:cNvGraphicFramePr>
+              <a:graphicFrameLocks xmlns:a="http://schemas.openxmlformats.org/drawingml/2006/main" noChangeAspect="1"/>
+            </wp:cNvGraphicFramePr>
+            <a:graphic xmlns:a="http://schemas.openxmlformats.org/drawingml/2006/main">
+              <a:graphicData uri="http://schemas.openxmlformats.org/drawingml/2006/picture">
+                <pic:pic xmlns:pic="http://schemas.openxmlformats.org/drawingml/2006/picture">
+                  <pic:nvPicPr>
+                    <pic:cNvPr id="497494484" name="Grafik 1" descr="Ein Bild, das Text, Schrift, Screenshot, Reihe enthält.&#10;&#10;KI-generierte Inhalte können fehlerhaft sein."/>
+                    <pic:cNvPicPr/>
+                  </pic:nvPicPr>
+                  <pic:blipFill>
+                    <a:blip r:embed="rId19"/>
+                    <a:stretch>
+                      <a:fillRect/>
+                    </a:stretch>
+                  </pic:blipFill>
+                  <pic:spPr>
+                    <a:xfrm>
+                      <a:off x="0" y="0"/>
+                      <a:ext cx="3577943" cy="1759644"/>
+                    </a:xfrm>
+                    <a:prstGeom prst="rect">
+                      <a:avLst/>
+                    </a:prstGeom>
+                  </pic:spPr>
+                </pic:pic>
+              </a:graphicData>
+            </a:graphic>
+          </wp:inline>
+        </w:drawing>
+      </w:r>
+    </w:p>
+    <w:p>
+      <w:r>
+        <w:t>Im Dokument unter "</w:t>
+      </w:r>
+      <w:proofErr w:type="spellStart"/>
+      <w:r>
+        <w:t>Awesome_Gripper</w:t>
+      </w:r>
+      <w:proofErr w:type="spellEnd"/>
+      <w:r>
+        <w:t>/Dokumentation und Berechnung/PLA_Materialeigenschaften.pdf" ist die Streckspannung des verwendeten PLA-Materials aufgeführt. Diese wird in der folgenden Berechnung zur Ermittlung des Sicherheitsfaktors verwendet, indem die auf das Bauteil wirkende Spannung durch die Streckspannung dividiert wird.</w:t>
+      </w:r>
+      <w:r>
+        <w:br/>
+      </w:r>
+      <w:r>
+        <w:rPr>
+          <w:noProof/>
+        </w:rPr>
+        <w:drawing>
+          <wp:inline distT="0" distB="0" distL="0" distR="0" wp14:anchorId="723E7450" wp14:editId="00B65C25">
+            <wp:extent cx="4266667" cy="2114286"/>
+            <wp:effectExtent l="0" t="0" r="635" b="635"/>
+            <wp:docPr id="929610221" name="Grafik 1" descr="Ein Bild, das Text, Schrift, Screenshot, weiß enthält.&#10;&#10;KI-generierte Inhalte können fehlerhaft sein."/>
+            <wp:cNvGraphicFramePr>
+              <a:graphicFrameLocks xmlns:a="http://schemas.openxmlformats.org/drawingml/2006/main" noChangeAspect="1"/>
+            </wp:cNvGraphicFramePr>
+            <a:graphic xmlns:a="http://schemas.openxmlformats.org/drawingml/2006/main">
+              <a:graphicData uri="http://schemas.openxmlformats.org/drawingml/2006/picture">
+                <pic:pic xmlns:pic="http://schemas.openxmlformats.org/drawingml/2006/picture">
+                  <pic:nvPicPr>
+                    <pic:cNvPr id="929610221" name="Grafik 1" descr="Ein Bild, das Text, Schrift, Screenshot, weiß enthält.&#10;&#10;KI-generierte Inhalte können fehlerhaft sein."/>
+                    <pic:cNvPicPr/>
+                  </pic:nvPicPr>
+                  <pic:blipFill>
+                    <a:blip r:embed="rId20"/>
+                    <a:stretch>
+                      <a:fillRect/>
+                    </a:stretch>
+                  </pic:blipFill>
+                  <pic:spPr>
+                    <a:xfrm>
+                      <a:off x="0" y="0"/>
+                      <a:ext cx="4266667" cy="2114286"/>
+                    </a:xfrm>
+                    <a:prstGeom prst="rect">
+                      <a:avLst/>
+                    </a:prstGeom>
+                  </pic:spPr>
+                </pic:pic>
+              </a:graphicData>
+            </a:graphic>
+          </wp:inline>
+        </w:drawing>
+      </w:r>
+      <w:r>
+        <w:t xml:space="preserve"> </w:t>
+      </w:r>
+    </w:p>
+    <w:p>
+      <w:r>
+        <w:t>Daraus ergibt sich ein Sicherheitsfaktor von 336.</w:t>
+      </w:r>
+    </w:p>
+    <w:p>
       <w:pPr>
         <w:pStyle w:val="berschrift1"/>
       </w:pPr>
-      <w:bookmarkStart w:id="11" w:name="_Toc189674381"/>
+      <w:bookmarkStart w:id="19" w:name="_Toc190272639"/>
       <w:r>
         <w:t>Konstruktive Gestaltung</w:t>
       </w:r>
-      <w:bookmarkEnd w:id="11"/>
+      <w:bookmarkEnd w:id="19"/>
     </w:p>
     <w:p/>
     <w:p>
       <w:pPr>
         <w:pStyle w:val="berschrift1"/>
       </w:pPr>
-      <w:bookmarkStart w:id="12" w:name="_Toc189674382"/>
+      <w:bookmarkStart w:id="20" w:name="_Toc190272640"/>
       <w:r>
         <w:t>Adaption zur Lösung</w:t>
       </w:r>
-      <w:bookmarkEnd w:id="12"/>
+      <w:bookmarkEnd w:id="20"/>
     </w:p>
     <w:p/>
     <w:p>
       <w:r>
         <w:br w:type="page"/>
       </w:r>
-      <w:bookmarkStart w:id="13" w:name="_Toc121319663"/>
-      <w:bookmarkStart w:id="14" w:name="_Toc121319739"/>
-      <w:bookmarkStart w:id="15" w:name="_Toc129777481"/>
+      <w:bookmarkStart w:id="21" w:name="_Toc121319663"/>
+      <w:bookmarkStart w:id="22" w:name="_Toc121319739"/>
+      <w:bookmarkStart w:id="23" w:name="_Toc129777481"/>
       <w:r>
         <w:lastRenderedPageBreak/>
         <w:t>Abbildungsverzeichnis</w:t>
       </w:r>
-      <w:bookmarkEnd w:id="13"/>
-      <w:bookmarkEnd w:id="14"/>
-      <w:bookmarkEnd w:id="15"/>
+      <w:bookmarkEnd w:id="21"/>
+      <w:bookmarkEnd w:id="22"/>
+      <w:bookmarkEnd w:id="23"/>
     </w:p>
     <w:p>
       <w:pPr>
@@ -2026,7 +2357,11 @@
         <w:rPr>
           <w:rFonts w:asciiTheme="minorHAnsi" w:eastAsiaTheme="minorEastAsia" w:hAnsiTheme="minorHAnsi"/>
           <w:noProof/>
+          <w:kern w:val="2"/>
+          <w:sz w:val="24"/>
+          <w:szCs w:val="24"/>
           <w:lang w:eastAsia="de-AT"/>
+          <w14:ligatures w14:val="standardContextual"/>
         </w:rPr>
       </w:pPr>
       <w:r>
@@ -2038,13 +2373,13 @@
       <w:r>
         <w:fldChar w:fldCharType="separate"/>
       </w:r>
-      <w:hyperlink w:anchor="_Toc129777719" w:history="1">
+      <w:hyperlink w:anchor="_Toc190271938" w:history="1">
         <w:r>
           <w:rPr>
             <w:rStyle w:val="Hyperlink"/>
             <w:noProof/>
           </w:rPr>
-          <w:t>Abbildung 1: Ein Zitronenfisch (Zitronenfischzeichner, 2022)</w:t>
+          <w:t>Abbildung 1: Werkstück</w:t>
         </w:r>
         <w:r>
           <w:rPr>
@@ -2065,7 +2400,7 @@
             <w:noProof/>
             <w:webHidden/>
           </w:rPr>
-          <w:instrText xml:space="preserve"> PAGEREF _Toc129777719 \h </w:instrText>
+          <w:instrText xml:space="preserve"> PAGEREF _Toc190271938 \h </w:instrText>
         </w:r>
         <w:r>
           <w:rPr>
@@ -2085,6 +2420,228 @@
             <w:noProof/>
             <w:webHidden/>
           </w:rPr>
+          <w:t>3</w:t>
+        </w:r>
+        <w:r>
+          <w:rPr>
+            <w:noProof/>
+            <w:webHidden/>
+          </w:rPr>
+          <w:fldChar w:fldCharType="end"/>
+        </w:r>
+      </w:hyperlink>
+    </w:p>
+    <w:p>
+      <w:pPr>
+        <w:pStyle w:val="Abbildungsverzeichnis"/>
+        <w:tabs>
+          <w:tab w:val="right" w:pos="9912"/>
+        </w:tabs>
+        <w:rPr>
+          <w:rFonts w:asciiTheme="minorHAnsi" w:eastAsiaTheme="minorEastAsia" w:hAnsiTheme="minorHAnsi"/>
+          <w:noProof/>
+          <w:kern w:val="2"/>
+          <w:sz w:val="24"/>
+          <w:szCs w:val="24"/>
+          <w:lang w:eastAsia="de-AT"/>
+          <w14:ligatures w14:val="standardContextual"/>
+        </w:rPr>
+      </w:pPr>
+      <w:hyperlink w:anchor="_Toc190271939" w:history="1">
+        <w:r>
+          <w:rPr>
+            <w:rStyle w:val="Hyperlink"/>
+            <w:noProof/>
+          </w:rPr>
+          <w:t>Abbildung 2: Anlagen Skizze</w:t>
+        </w:r>
+        <w:r>
+          <w:rPr>
+            <w:noProof/>
+            <w:webHidden/>
+          </w:rPr>
+          <w:tab/>
+        </w:r>
+        <w:r>
+          <w:rPr>
+            <w:noProof/>
+            <w:webHidden/>
+          </w:rPr>
+          <w:fldChar w:fldCharType="begin"/>
+        </w:r>
+        <w:r>
+          <w:rPr>
+            <w:noProof/>
+            <w:webHidden/>
+          </w:rPr>
+          <w:instrText xml:space="preserve"> PAGEREF _Toc190271939 \h </w:instrText>
+        </w:r>
+        <w:r>
+          <w:rPr>
+            <w:noProof/>
+            <w:webHidden/>
+          </w:rPr>
+        </w:r>
+        <w:r>
+          <w:rPr>
+            <w:noProof/>
+            <w:webHidden/>
+          </w:rPr>
+          <w:fldChar w:fldCharType="separate"/>
+        </w:r>
+        <w:r>
+          <w:rPr>
+            <w:noProof/>
+            <w:webHidden/>
+          </w:rPr>
+          <w:t>3</w:t>
+        </w:r>
+        <w:r>
+          <w:rPr>
+            <w:noProof/>
+            <w:webHidden/>
+          </w:rPr>
+          <w:fldChar w:fldCharType="end"/>
+        </w:r>
+      </w:hyperlink>
+    </w:p>
+    <w:p>
+      <w:pPr>
+        <w:pStyle w:val="Abbildungsverzeichnis"/>
+        <w:tabs>
+          <w:tab w:val="right" w:pos="9912"/>
+        </w:tabs>
+        <w:rPr>
+          <w:rFonts w:asciiTheme="minorHAnsi" w:eastAsiaTheme="minorEastAsia" w:hAnsiTheme="minorHAnsi"/>
+          <w:noProof/>
+          <w:kern w:val="2"/>
+          <w:sz w:val="24"/>
+          <w:szCs w:val="24"/>
+          <w:lang w:eastAsia="de-AT"/>
+          <w14:ligatures w14:val="standardContextual"/>
+        </w:rPr>
+      </w:pPr>
+      <w:hyperlink w:anchor="_Toc190271940" w:history="1">
+        <w:r>
+          <w:rPr>
+            <w:rStyle w:val="Hyperlink"/>
+            <w:noProof/>
+          </w:rPr>
+          <w:t>Abbildung 3: Bauteil Orientierung (Rechts – Zuführung | Links Abführung)</w:t>
+        </w:r>
+        <w:r>
+          <w:rPr>
+            <w:noProof/>
+            <w:webHidden/>
+          </w:rPr>
+          <w:tab/>
+        </w:r>
+        <w:r>
+          <w:rPr>
+            <w:noProof/>
+            <w:webHidden/>
+          </w:rPr>
+          <w:fldChar w:fldCharType="begin"/>
+        </w:r>
+        <w:r>
+          <w:rPr>
+            <w:noProof/>
+            <w:webHidden/>
+          </w:rPr>
+          <w:instrText xml:space="preserve"> PAGEREF _Toc190271940 \h </w:instrText>
+        </w:r>
+        <w:r>
+          <w:rPr>
+            <w:noProof/>
+            <w:webHidden/>
+          </w:rPr>
+        </w:r>
+        <w:r>
+          <w:rPr>
+            <w:noProof/>
+            <w:webHidden/>
+          </w:rPr>
+          <w:fldChar w:fldCharType="separate"/>
+        </w:r>
+        <w:r>
+          <w:rPr>
+            <w:noProof/>
+            <w:webHidden/>
+          </w:rPr>
+          <w:t>4</w:t>
+        </w:r>
+        <w:r>
+          <w:rPr>
+            <w:noProof/>
+            <w:webHidden/>
+          </w:rPr>
+          <w:fldChar w:fldCharType="end"/>
+        </w:r>
+      </w:hyperlink>
+    </w:p>
+    <w:p>
+      <w:pPr>
+        <w:pStyle w:val="Abbildungsverzeichnis"/>
+        <w:tabs>
+          <w:tab w:val="right" w:pos="9912"/>
+        </w:tabs>
+        <w:rPr>
+          <w:rFonts w:asciiTheme="minorHAnsi" w:eastAsiaTheme="minorEastAsia" w:hAnsiTheme="minorHAnsi"/>
+          <w:noProof/>
+          <w:kern w:val="2"/>
+          <w:sz w:val="24"/>
+          <w:szCs w:val="24"/>
+          <w:lang w:eastAsia="de-AT"/>
+          <w14:ligatures w14:val="standardContextual"/>
+        </w:rPr>
+      </w:pPr>
+      <w:hyperlink w:anchor="_Toc190271941" w:history="1">
+        <w:r>
+          <w:rPr>
+            <w:rStyle w:val="Hyperlink"/>
+            <w:noProof/>
+          </w:rPr>
+          <w:t>Abbildung 4: Schematische Skizze des Parallelbackengreifers</w:t>
+        </w:r>
+        <w:r>
+          <w:rPr>
+            <w:noProof/>
+            <w:webHidden/>
+          </w:rPr>
+          <w:tab/>
+        </w:r>
+        <w:r>
+          <w:rPr>
+            <w:noProof/>
+            <w:webHidden/>
+          </w:rPr>
+          <w:fldChar w:fldCharType="begin"/>
+        </w:r>
+        <w:r>
+          <w:rPr>
+            <w:noProof/>
+            <w:webHidden/>
+          </w:rPr>
+          <w:instrText xml:space="preserve"> PAGEREF _Toc190271941 \h </w:instrText>
+        </w:r>
+        <w:r>
+          <w:rPr>
+            <w:noProof/>
+            <w:webHidden/>
+          </w:rPr>
+        </w:r>
+        <w:r>
+          <w:rPr>
+            <w:noProof/>
+            <w:webHidden/>
+          </w:rPr>
+          <w:fldChar w:fldCharType="separate"/>
+        </w:r>
+        <w:r>
+          <w:rPr>
+            <w:noProof/>
+            <w:webHidden/>
+          </w:rPr>
           <w:t>5</w:t>
         </w:r>
         <w:r>
@@ -2097,6 +2654,228 @@
       </w:hyperlink>
     </w:p>
     <w:p>
+      <w:pPr>
+        <w:pStyle w:val="Abbildungsverzeichnis"/>
+        <w:tabs>
+          <w:tab w:val="right" w:pos="9912"/>
+        </w:tabs>
+        <w:rPr>
+          <w:rFonts w:asciiTheme="minorHAnsi" w:eastAsiaTheme="minorEastAsia" w:hAnsiTheme="minorHAnsi"/>
+          <w:noProof/>
+          <w:kern w:val="2"/>
+          <w:sz w:val="24"/>
+          <w:szCs w:val="24"/>
+          <w:lang w:eastAsia="de-AT"/>
+          <w14:ligatures w14:val="standardContextual"/>
+        </w:rPr>
+      </w:pPr>
+      <w:hyperlink w:anchor="_Toc190271942" w:history="1">
+        <w:r>
+          <w:rPr>
+            <w:rStyle w:val="Hyperlink"/>
+            <w:noProof/>
+          </w:rPr>
+          <w:t>Abbildung 5: Kinematische Kette des 7-gliedrigen Greifers</w:t>
+        </w:r>
+        <w:r>
+          <w:rPr>
+            <w:noProof/>
+            <w:webHidden/>
+          </w:rPr>
+          <w:tab/>
+        </w:r>
+        <w:r>
+          <w:rPr>
+            <w:noProof/>
+            <w:webHidden/>
+          </w:rPr>
+          <w:fldChar w:fldCharType="begin"/>
+        </w:r>
+        <w:r>
+          <w:rPr>
+            <w:noProof/>
+            <w:webHidden/>
+          </w:rPr>
+          <w:instrText xml:space="preserve"> PAGEREF _Toc190271942 \h </w:instrText>
+        </w:r>
+        <w:r>
+          <w:rPr>
+            <w:noProof/>
+            <w:webHidden/>
+          </w:rPr>
+        </w:r>
+        <w:r>
+          <w:rPr>
+            <w:noProof/>
+            <w:webHidden/>
+          </w:rPr>
+          <w:fldChar w:fldCharType="separate"/>
+        </w:r>
+        <w:r>
+          <w:rPr>
+            <w:noProof/>
+            <w:webHidden/>
+          </w:rPr>
+          <w:t>6</w:t>
+        </w:r>
+        <w:r>
+          <w:rPr>
+            <w:noProof/>
+            <w:webHidden/>
+          </w:rPr>
+          <w:fldChar w:fldCharType="end"/>
+        </w:r>
+      </w:hyperlink>
+    </w:p>
+    <w:p>
+      <w:pPr>
+        <w:pStyle w:val="Abbildungsverzeichnis"/>
+        <w:tabs>
+          <w:tab w:val="right" w:pos="9912"/>
+        </w:tabs>
+        <w:rPr>
+          <w:rFonts w:asciiTheme="minorHAnsi" w:eastAsiaTheme="minorEastAsia" w:hAnsiTheme="minorHAnsi"/>
+          <w:noProof/>
+          <w:kern w:val="2"/>
+          <w:sz w:val="24"/>
+          <w:szCs w:val="24"/>
+          <w:lang w:eastAsia="de-AT"/>
+          <w14:ligatures w14:val="standardContextual"/>
+        </w:rPr>
+      </w:pPr>
+      <w:hyperlink w:anchor="_Toc190271943" w:history="1">
+        <w:r>
+          <w:rPr>
+            <w:rStyle w:val="Hyperlink"/>
+            <w:noProof/>
+          </w:rPr>
+          <w:t>Abbildung 6: Grafische Berechnung der Kraft im Punkt A mittels der h-Strecken Methode</w:t>
+        </w:r>
+        <w:r>
+          <w:rPr>
+            <w:noProof/>
+            <w:webHidden/>
+          </w:rPr>
+          <w:tab/>
+        </w:r>
+        <w:r>
+          <w:rPr>
+            <w:noProof/>
+            <w:webHidden/>
+          </w:rPr>
+          <w:fldChar w:fldCharType="begin"/>
+        </w:r>
+        <w:r>
+          <w:rPr>
+            <w:noProof/>
+            <w:webHidden/>
+          </w:rPr>
+          <w:instrText xml:space="preserve"> PAGEREF _Toc190271943 \h </w:instrText>
+        </w:r>
+        <w:r>
+          <w:rPr>
+            <w:noProof/>
+            <w:webHidden/>
+          </w:rPr>
+        </w:r>
+        <w:r>
+          <w:rPr>
+            <w:noProof/>
+            <w:webHidden/>
+          </w:rPr>
+          <w:fldChar w:fldCharType="separate"/>
+        </w:r>
+        <w:r>
+          <w:rPr>
+            <w:noProof/>
+            <w:webHidden/>
+          </w:rPr>
+          <w:t>8</w:t>
+        </w:r>
+        <w:r>
+          <w:rPr>
+            <w:noProof/>
+            <w:webHidden/>
+          </w:rPr>
+          <w:fldChar w:fldCharType="end"/>
+        </w:r>
+      </w:hyperlink>
+    </w:p>
+    <w:p>
+      <w:pPr>
+        <w:pStyle w:val="Abbildungsverzeichnis"/>
+        <w:tabs>
+          <w:tab w:val="right" w:pos="9912"/>
+        </w:tabs>
+        <w:rPr>
+          <w:rFonts w:asciiTheme="minorHAnsi" w:eastAsiaTheme="minorEastAsia" w:hAnsiTheme="minorHAnsi"/>
+          <w:noProof/>
+          <w:kern w:val="2"/>
+          <w:sz w:val="24"/>
+          <w:szCs w:val="24"/>
+          <w:lang w:eastAsia="de-AT"/>
+          <w14:ligatures w14:val="standardContextual"/>
+        </w:rPr>
+      </w:pPr>
+      <w:hyperlink w:anchor="_Toc190271944" w:history="1">
+        <w:r>
+          <w:rPr>
+            <w:rStyle w:val="Hyperlink"/>
+            <w:noProof/>
+          </w:rPr>
+          <w:t>Abbildung 7: Geometrische Herleitung der Zugspannung auf das 2 und 7 Glied des Endeffektors</w:t>
+        </w:r>
+        <w:r>
+          <w:rPr>
+            <w:noProof/>
+            <w:webHidden/>
+          </w:rPr>
+          <w:tab/>
+        </w:r>
+        <w:r>
+          <w:rPr>
+            <w:noProof/>
+            <w:webHidden/>
+          </w:rPr>
+          <w:fldChar w:fldCharType="begin"/>
+        </w:r>
+        <w:r>
+          <w:rPr>
+            <w:noProof/>
+            <w:webHidden/>
+          </w:rPr>
+          <w:instrText xml:space="preserve"> PAGEREF _Toc190271944 \h </w:instrText>
+        </w:r>
+        <w:r>
+          <w:rPr>
+            <w:noProof/>
+            <w:webHidden/>
+          </w:rPr>
+        </w:r>
+        <w:r>
+          <w:rPr>
+            <w:noProof/>
+            <w:webHidden/>
+          </w:rPr>
+          <w:fldChar w:fldCharType="separate"/>
+        </w:r>
+        <w:r>
+          <w:rPr>
+            <w:noProof/>
+            <w:webHidden/>
+          </w:rPr>
+          <w:t>9</w:t>
+        </w:r>
+        <w:r>
+          <w:rPr>
+            <w:noProof/>
+            <w:webHidden/>
+          </w:rPr>
+          <w:fldChar w:fldCharType="end"/>
+        </w:r>
+      </w:hyperlink>
+    </w:p>
+    <w:p>
       <w:r>
         <w:fldChar w:fldCharType="end"/>
       </w:r>
@@ -2107,97 +2886,27 @@
     <w:p>
       <w:pPr>
         <w:pStyle w:val="berschrift1"/>
-      </w:pPr>
-      <w:bookmarkStart w:id="16" w:name="_Toc121319664"/>
-      <w:bookmarkStart w:id="17" w:name="_Toc121319741"/>
-      <w:bookmarkStart w:id="18" w:name="_Toc129777483"/>
-      <w:bookmarkStart w:id="19" w:name="_Toc189674383"/>
-      <w:r>
+        <w:rPr>
+          <w:lang w:val="en-NZ"/>
+        </w:rPr>
+      </w:pPr>
+      <w:bookmarkStart w:id="24" w:name="_Toc121319664"/>
+      <w:bookmarkStart w:id="25" w:name="_Toc121319741"/>
+      <w:bookmarkStart w:id="26" w:name="_Toc129777483"/>
+      <w:bookmarkStart w:id="27" w:name="_Toc190272641"/>
+      <w:proofErr w:type="spellStart"/>
+      <w:r>
+        <w:rPr>
+          <w:lang w:val="en-NZ"/>
+        </w:rPr>
         <w:lastRenderedPageBreak/>
         <w:t>Literaturverzeichnis</w:t>
       </w:r>
-      <w:bookmarkEnd w:id="16"/>
-      <w:bookmarkEnd w:id="17"/>
-      <w:bookmarkEnd w:id="18"/>
-      <w:bookmarkEnd w:id="19"/>
-    </w:p>
-    <w:p>
-      <w:pPr>
-        <w:pStyle w:val="Literaturverzeichnis"/>
-        <w:ind w:left="720" w:hanging="720"/>
-        <w:rPr>
-          <w:noProof/>
-          <w:sz w:val="24"/>
-          <w:szCs w:val="24"/>
-        </w:rPr>
-      </w:pPr>
-      <w:r>
-        <w:rPr>
-          <w:rFonts w:eastAsiaTheme="majorEastAsia" w:cstheme="majorBidi"/>
-          <w:color w:val="00649C"/>
-          <w:sz w:val="72"/>
-          <w:szCs w:val="32"/>
-        </w:rPr>
-        <w:fldChar w:fldCharType="begin"/>
-      </w:r>
-      <w:r>
-        <w:instrText xml:space="preserve"> BIBLIOGRAPHY  \l 3079 </w:instrText>
-      </w:r>
-      <w:r>
-        <w:rPr>
-          <w:rFonts w:eastAsiaTheme="majorEastAsia" w:cstheme="majorBidi"/>
-          <w:color w:val="00649C"/>
-          <w:sz w:val="72"/>
-          <w:szCs w:val="32"/>
-        </w:rPr>
-        <w:fldChar w:fldCharType="separate"/>
-      </w:r>
-      <w:r>
-        <w:rPr>
-          <w:noProof/>
-        </w:rPr>
-        <w:t xml:space="preserve">European Court of Human Rights, Council of Europe. </w:t>
-      </w:r>
-      <w:r>
-        <w:rPr>
-          <w:noProof/>
-        </w:rPr>
-        <w:t xml:space="preserve">(kein Datum). </w:t>
-      </w:r>
-      <w:r>
-        <w:rPr>
-          <w:i/>
-          <w:iCs/>
-          <w:noProof/>
-        </w:rPr>
-        <w:t>Die Europäische Menschenrechtskonvention (Fassung Protokoll 11, 14).</w:t>
-      </w:r>
-      <w:r>
-        <w:rPr>
-          <w:noProof/>
-        </w:rPr>
-        <w:t xml:space="preserve"> Abgerufen am 04. 03 2021 von https://www.echr.coe.int/Documents/Convention_DEU.pdf</w:t>
-      </w:r>
-    </w:p>
-    <w:p>
-      <w:pPr>
-        <w:pStyle w:val="Literaturverzeichnis"/>
-        <w:ind w:left="720" w:hanging="720"/>
-        <w:rPr>
-          <w:noProof/>
-        </w:rPr>
-      </w:pPr>
-      <w:r>
-        <w:rPr>
-          <w:noProof/>
-        </w:rPr>
-        <w:t>Zitronenfischzeichner. (22. 10 2022). Zitronenfisch. Meer.</w:t>
-      </w:r>
-    </w:p>
-    <w:p>
-      <w:r>
-        <w:fldChar w:fldCharType="end"/>
-      </w:r>
+      <w:bookmarkEnd w:id="24"/>
+      <w:bookmarkEnd w:id="25"/>
+      <w:bookmarkEnd w:id="26"/>
+      <w:bookmarkEnd w:id="27"/>
+      <w:proofErr w:type="spellEnd"/>
     </w:p>
     <w:sdt>
       <w:sdtPr>
@@ -2235,11 +2944,11 @@
           <w:r>
             <w:tab/>
           </w:r>
-          <w:bookmarkStart w:id="20" w:name="_CTVL001ae33295acf7542409c55cac3d6c3a523"/>
+          <w:bookmarkStart w:id="28" w:name="_CTVL001ae33295acf7542409c55cac3d6c3a523"/>
           <w:r>
             <w:t>Gomeringer, R., Kilgus, R., Menges, V</w:t>
           </w:r>
-          <w:bookmarkEnd w:id="20"/>
+          <w:bookmarkEnd w:id="28"/>
           <w:r>
             <w:t>.</w:t>
           </w:r>
@@ -2250,7 +2959,15 @@
             <w:t>, et al.</w:t>
           </w:r>
           <w:r>
-            <w:t>: ‘Tabellenbuch Metall: Mit Formelsammlung’ (Verlag Europa-Lehrmittel Nourney Vollmer GmbH &amp; Co. KG, Haan-Gruiten, 2024, 49th edn.)</w:t>
+            <w:t xml:space="preserve">: ‘Tabellenbuch Metall: Mit Formelsammlung’ (Verlag Europa-Lehrmittel Nourney Vollmer GmbH &amp; Co. KG, Haan-Gruiten, 2024, 49th </w:t>
+          </w:r>
+          <w:proofErr w:type="spellStart"/>
+          <w:r>
+            <w:t>edn</w:t>
+          </w:r>
+          <w:proofErr w:type="spellEnd"/>
+          <w:r>
+            <w:t>.)</w:t>
           </w:r>
           <w:r>
             <w:fldChar w:fldCharType="end"/>
@@ -2260,12 +2977,12 @@
     </w:sdt>
     <w:p/>
     <w:sectPr>
-      <w:headerReference w:type="even" r:id="rId18"/>
-      <w:headerReference w:type="default" r:id="rId19"/>
-      <w:footerReference w:type="even" r:id="rId20"/>
-      <w:footerReference w:type="default" r:id="rId21"/>
-      <w:headerReference w:type="first" r:id="rId22"/>
-      <w:footerReference w:type="first" r:id="rId23"/>
+      <w:headerReference w:type="even" r:id="rId21"/>
+      <w:headerReference w:type="default" r:id="rId22"/>
+      <w:footerReference w:type="even" r:id="rId23"/>
+      <w:footerReference w:type="default" r:id="rId24"/>
+      <w:headerReference w:type="first" r:id="rId25"/>
+      <w:footerReference w:type="first" r:id="rId26"/>
       <w:pgSz w:w="11906" w:h="16838" w:code="9"/>
       <w:pgMar w:top="992" w:right="992" w:bottom="992" w:left="992" w:header="709" w:footer="709" w:gutter="0"/>
       <w:cols w:space="708"/>
@@ -4650,6 +5367,13 @@
     <w:pitch w:val="variable"/>
     <w:sig w:usb0="00000000" w:usb1="10000000" w:usb2="00000000" w:usb3="00000000" w:csb0="80000000" w:csb1="00000000"/>
   </w:font>
+  <w:font w:name="Cambria Math">
+    <w:panose1 w:val="02040503050406030204"/>
+    <w:charset w:val="00"/>
+    <w:family w:val="roman"/>
+    <w:pitch w:val="variable"/>
+    <w:sig w:usb0="E00006FF" w:usb1="420024FF" w:usb2="02000000" w:usb3="00000000" w:csb0="0000019F" w:csb1="00000000"/>
+  </w:font>
   <w:font w:name="Aptos">
     <w:charset w:val="00"/>
     <w:family w:val="swiss"/>
@@ -4683,8 +5407,11 @@
   <w:rsids>
     <w:rsidRoot w:val="00FA6919"/>
     <w:rsid w:val="001C27B8"/>
+    <w:rsid w:val="002E1E29"/>
     <w:rsid w:val="00570805"/>
     <w:rsid w:val="007144EC"/>
+    <w:rsid w:val="00AB71BE"/>
+    <w:rsid w:val="00B86A8E"/>
     <w:rsid w:val="00F25329"/>
     <w:rsid w:val="00FA6919"/>
   </w:rsids>
@@ -5142,7 +5869,7 @@
     <w:basedOn w:val="Absatz-Standardschriftart"/>
     <w:uiPriority w:val="99"/>
     <w:semiHidden/>
-    <w:rsid w:val="00570805"/>
+    <w:rsid w:val="00AB71BE"/>
     <w:rPr>
       <w:color w:val="808080"/>
     </w:rPr>
@@ -5421,32 +6148,7 @@
 </a:theme>
 </file>
 
-<file path=customXml/item1.xml>��< ? x m l   v e r s i o n = " 1 . 0 "   e n c o d i n g = " u t f - 1 6 " ? > < D o c u m e n t S e t t i n g s   x m l n s : x s i = " h t t p : / / w w w . w 3 . o r g / 2 0 0 1 / X M L S c h e m a - i n s t a n c e "   x m l n s : x s d = " h t t p : / / w w w . w 3 . o r g / 2 0 0 1 / X M L S c h e m a "   x m l n s = " h t t p : / / w w w . z h a w . c h / A c c e s s i b i l i t y A d d I n " > - 
-     < C h e c k H e a d i n g H i e r a r c h y > t r u e < / C h e c k H e a d i n g H i e r a r c h y > - 
-     < C h e c k R e a d i n g O r d e r > f a l s e < / C h e c k R e a d i n g O r d e r > - 
-     < C h e c k T a b l e H e a d e r > t r u e < / C h e c k T a b l e H e a d e r > - 
-     < C h e c k D o c T i t l e > t r u e < / C h e c k D o c T i t l e > - 
-     < C h e c k L a n g u a g e S e t t i n g > t r u e < / C h e c k L a n g u a g e S e t t i n g > - 
-     < C h e c k A l t T e x t > t r u e < / C h e c k A l t T e x t > - 
-     < C h e c k T e x t S i z e > f a l s e < / C h e c k T e x t S i z e > - 
-     < C h e c k S c r e e n T i p > t r u e < / C h e c k S c r e e n T i p > - 
-     < S h o w S h a p e N a m e C o l u m n > f a l s e < / S h o w S h a p e N a m e C o l u m n > - 
-     < S h o w I s s u e D e s c r i p t i o n > t r u e < / S h o w I s s u e D e s c r i p t i o n > - 
- < / D o c u m e n t S e t t i n g s > 
-</file>
-
-<file path=customXml/item2.xml><?xml version="1.0" encoding="utf-8"?>
+<file path=customXml/item1.xml><?xml version="1.0" encoding="utf-8"?>
 <b:Sources xmlns:b="http://schemas.openxmlformats.org/officeDocument/2006/bibliography" xmlns="http://schemas.openxmlformats.org/officeDocument/2006/bibliography" SelectedStyle="\APASixthEditionOfficeOnline.xsl" StyleName="APA" Version="6">
   <b:Source>
     <b:Tag>Zit22</b:Tag>
@@ -5487,19 +6189,44 @@
 </b:Sources>
 </file>
 
+<file path=customXml/item2.xml>��< ? x m l   v e r s i o n = " 1 . 0 "   e n c o d i n g = " u t f - 1 6 " ? > < D o c u m e n t S e t t i n g s   x m l n s : x s i = " h t t p : / / w w w . w 3 . o r g / 2 0 0 1 / X M L S c h e m a - i n s t a n c e "   x m l n s : x s d = " h t t p : / / w w w . w 3 . o r g / 2 0 0 1 / X M L S c h e m a "   x m l n s = " h t t p : / / w w w . z h a w . c h / A c c e s s i b i l i t y A d d I n " > + 
+     < C h e c k H e a d i n g H i e r a r c h y > t r u e < / C h e c k H e a d i n g H i e r a r c h y > + 
+     < C h e c k R e a d i n g O r d e r > f a l s e < / C h e c k R e a d i n g O r d e r > + 
+     < C h e c k T a b l e H e a d e r > t r u e < / C h e c k T a b l e H e a d e r > + 
+     < C h e c k D o c T i t l e > t r u e < / C h e c k D o c T i t l e > + 
+     < C h e c k L a n g u a g e S e t t i n g > t r u e < / C h e c k L a n g u a g e S e t t i n g > + 
+     < C h e c k A l t T e x t > t r u e < / C h e c k A l t T e x t > + 
+     < C h e c k T e x t S i z e > f a l s e < / C h e c k T e x t S i z e > + 
+     < C h e c k S c r e e n T i p > t r u e < / C h e c k S c r e e n T i p > + 
+     < S h o w S h a p e N a m e C o l u m n > f a l s e < / S h o w S h a p e N a m e C o l u m n > + 
+     < S h o w I s s u e D e s c r i p t i o n > t r u e < / S h o w I s s u e D e s c r i p t i o n > + 
+ < / D o c u m e n t S e t t i n g s > 
+</file>
+
 <file path=customXml/itemProps1.xml><?xml version="1.0" encoding="utf-8"?>
+<ds:datastoreItem xmlns:ds="http://schemas.openxmlformats.org/officeDocument/2006/customXml" ds:itemID="{82881D81-B07A-40A3-826B-39C868CF3A6B}">
+  <ds:schemaRefs>
+    <ds:schemaRef ds:uri="http://schemas.openxmlformats.org/officeDocument/2006/bibliography"/>
+  </ds:schemaRefs>
+</ds:datastoreItem>
+</file>
+
+<file path=customXml/itemProps2.xml><?xml version="1.0" encoding="utf-8"?>
 <ds:datastoreItem xmlns:ds="http://schemas.openxmlformats.org/officeDocument/2006/customXml" ds:itemID="{A2071FAF-8228-4A81-8C02-DF3837FABB5E}">
   <ds:schemaRefs>
     <ds:schemaRef ds:uri="http://www.w3.org/2001/XMLSchema"/>
     <ds:schemaRef ds:uri="http://www.zhaw.ch/AccessibilityAddIn"/>
   </ds:schemaRefs>
 </ds:datastoreItem>
-</file>
-
-<file path=customXml/itemProps2.xml><?xml version="1.0" encoding="utf-8"?>
-<ds:datastoreItem xmlns:ds="http://schemas.openxmlformats.org/officeDocument/2006/customXml" ds:itemID="{82881D81-B07A-40A3-826B-39C868CF3A6B}">
-  <ds:schemaRefs>
-    <ds:schemaRef ds:uri="http://schemas.openxmlformats.org/officeDocument/2006/bibliography"/>
-  </ds:schemaRefs>
-</ds:datastoreItem>
 </file>
</xml_diff>

<commit_message>
Fusion 360 Baugrppe, Dokumentation, FE-Analyse
</commit_message>
<xml_diff>
--- a/Dokumentation und Berechnung/Awesome_Gripper.docx
+++ b/Dokumentation und Berechnung/Awesome_Gripper.docx
@@ -716,7 +716,7 @@
         </w:rPr>
       </w:pPr>
       <w:bookmarkStart w:id="2" w:name="_Ref189671489"/>
-      <w:bookmarkStart w:id="3" w:name="_Toc190271938"/>
+      <w:bookmarkStart w:id="3" w:name="_Toc190283429"/>
       <w:r>
         <w:rPr>
           <w:lang w:val="de-AT"/>
@@ -839,7 +839,7 @@
         </w:rPr>
       </w:pPr>
       <w:bookmarkStart w:id="4" w:name="_Ref189671919"/>
-      <w:bookmarkStart w:id="5" w:name="_Toc190271939"/>
+      <w:bookmarkStart w:id="5" w:name="_Toc190283430"/>
       <w:r>
         <w:rPr>
           <w:lang w:val="de-AT"/>
@@ -963,7 +963,7 @@
         </w:rPr>
       </w:pPr>
       <w:bookmarkStart w:id="6" w:name="_Ref189672543"/>
-      <w:bookmarkStart w:id="7" w:name="_Toc190271940"/>
+      <w:bookmarkStart w:id="7" w:name="_Toc190283431"/>
       <w:r>
         <w:rPr>
           <w:lang w:val="de-AT"/>
@@ -1238,7 +1238,7 @@
         </w:rPr>
       </w:pPr>
       <w:bookmarkStart w:id="9" w:name="_Ref189674488"/>
-      <w:bookmarkStart w:id="10" w:name="_Toc190271941"/>
+      <w:bookmarkStart w:id="10" w:name="_Toc190283432"/>
       <w:r>
         <w:rPr>
           <w:lang w:val="de-AT"/>
@@ -1393,7 +1393,7 @@
         </w:rPr>
       </w:pPr>
       <w:bookmarkStart w:id="11" w:name="_Ref189675952"/>
-      <w:bookmarkStart w:id="12" w:name="_Toc190271942"/>
+      <w:bookmarkStart w:id="12" w:name="_Toc190283433"/>
       <w:r>
         <w:rPr>
           <w:lang w:val="de-AT"/>
@@ -1934,7 +1934,7 @@
         </w:rPr>
       </w:pPr>
       <w:bookmarkStart w:id="14" w:name="_Ref189679923"/>
-      <w:bookmarkStart w:id="15" w:name="_Toc190271943"/>
+      <w:bookmarkStart w:id="15" w:name="_Toc190283434"/>
       <w:r>
         <w:rPr>
           <w:lang w:val="de-AT"/>
@@ -2107,6 +2107,9 @@
         <w:br/>
       </w:r>
       <w:r>
+        <w:rPr>
+          <w:noProof/>
+        </w:rPr>
         <w:drawing>
           <wp:inline distT="0" distB="0" distL="0" distR="0" wp14:anchorId="5B399ED9" wp14:editId="49D45B78">
             <wp:extent cx="6300470" cy="5810250"/>
@@ -2152,7 +2155,7 @@
         </w:rPr>
       </w:pPr>
       <w:bookmarkStart w:id="17" w:name="_Ref190270853"/>
-      <w:bookmarkStart w:id="18" w:name="_Toc190271944"/>
+      <w:bookmarkStart w:id="18" w:name="_Toc190283435"/>
       <w:r>
         <w:rPr>
           <w:lang w:val="de-AT"/>
@@ -2311,42 +2314,2204 @@
         <w:t>Daraus ergibt sich ein Sicherheitsfaktor von 336.</w:t>
       </w:r>
     </w:p>
+    <w:p/>
+    <w:p>
+      <w:r>
+        <w:br w:type="page"/>
+      </w:r>
+    </w:p>
     <w:p>
       <w:pPr>
         <w:pStyle w:val="berschrift1"/>
       </w:pPr>
       <w:bookmarkStart w:id="19" w:name="_Toc190272639"/>
       <w:r>
+        <w:lastRenderedPageBreak/>
         <w:t>Konstruktive Gestaltung</w:t>
       </w:r>
       <w:bookmarkEnd w:id="19"/>
     </w:p>
+    <w:p>
+      <w:r>
+        <w:t xml:space="preserve">Die Konstruktion und die FE-Analyse wurden in Autodesk Fusion 360 umgesetzt. Der Greifer setzt sich aus 7 verschiedenen Teilen zusammen, wobei der Finger 4-mal und </w:t>
+      </w:r>
+      <w:proofErr w:type="spellStart"/>
+      <w:r>
+        <w:t>Tip</w:t>
+      </w:r>
+      <w:proofErr w:type="spellEnd"/>
+      <w:r>
+        <w:t xml:space="preserve"> und Support Lever 2-mal verbaut sind (siehe Zeichnung).</w:t>
+      </w:r>
+      <w:r>
+        <w:br/>
+      </w:r>
+    </w:p>
+    <w:tbl>
+      <w:tblPr>
+        <w:tblStyle w:val="Tabellenraster"/>
+        <w:tblpPr w:leftFromText="141" w:rightFromText="141" w:vertAnchor="text" w:horzAnchor="margin" w:tblpXSpec="center" w:tblpY="6781"/>
+        <w:tblW w:w="5168" w:type="dxa"/>
+        <w:tblLook w:val="04A0" w:firstRow="1" w:lastRow="0" w:firstColumn="1" w:lastColumn="0" w:noHBand="0" w:noVBand="1"/>
+      </w:tblPr>
+      <w:tblGrid>
+        <w:gridCol w:w="1140"/>
+        <w:gridCol w:w="1127"/>
+        <w:gridCol w:w="1721"/>
+        <w:gridCol w:w="1180"/>
+      </w:tblGrid>
+      <w:tr>
+        <w:trPr>
+          <w:trHeight w:val="322"/>
+        </w:trPr>
+        <w:tc>
+          <w:tcPr>
+            <w:tcW w:w="1140" w:type="dxa"/>
+          </w:tcPr>
+          <w:p>
+            <w:r>
+              <w:t>Element</w:t>
+            </w:r>
+          </w:p>
+        </w:tc>
+        <w:tc>
+          <w:tcPr>
+            <w:tcW w:w="1127" w:type="dxa"/>
+          </w:tcPr>
+          <w:p>
+            <w:proofErr w:type="spellStart"/>
+            <w:r>
+              <w:t>Anzahl</w:t>
+            </w:r>
+            <w:proofErr w:type="spellEnd"/>
+          </w:p>
+        </w:tc>
+        <w:tc>
+          <w:tcPr>
+            <w:tcW w:w="1721" w:type="dxa"/>
+          </w:tcPr>
+          <w:p>
+            <w:proofErr w:type="spellStart"/>
+            <w:r>
+              <w:t>Bauteil</w:t>
+            </w:r>
+            <w:proofErr w:type="spellEnd"/>
+          </w:p>
+        </w:tc>
+        <w:tc>
+          <w:tcPr>
+            <w:tcW w:w="1180" w:type="dxa"/>
+          </w:tcPr>
+          <w:p/>
+        </w:tc>
+      </w:tr>
+      <w:tr>
+        <w:trPr>
+          <w:trHeight w:val="303"/>
+        </w:trPr>
+        <w:tc>
+          <w:tcPr>
+            <w:tcW w:w="1140" w:type="dxa"/>
+          </w:tcPr>
+          <w:p>
+            <w:r>
+              <w:t>1</w:t>
+            </w:r>
+          </w:p>
+        </w:tc>
+        <w:tc>
+          <w:tcPr>
+            <w:tcW w:w="1127" w:type="dxa"/>
+          </w:tcPr>
+          <w:p>
+            <w:r>
+              <w:t>1</w:t>
+            </w:r>
+          </w:p>
+        </w:tc>
+        <w:tc>
+          <w:tcPr>
+            <w:tcW w:w="1721" w:type="dxa"/>
+          </w:tcPr>
+          <w:p>
+            <w:r>
+              <w:t>Baseplate</w:t>
+            </w:r>
+          </w:p>
+        </w:tc>
+        <w:tc>
+          <w:tcPr>
+            <w:tcW w:w="1180" w:type="dxa"/>
+          </w:tcPr>
+          <w:p>
+            <w:r>
+              <w:t>PLA</w:t>
+            </w:r>
+          </w:p>
+        </w:tc>
+      </w:tr>
+      <w:tr>
+        <w:trPr>
+          <w:trHeight w:val="322"/>
+        </w:trPr>
+        <w:tc>
+          <w:tcPr>
+            <w:tcW w:w="1140" w:type="dxa"/>
+          </w:tcPr>
+          <w:p>
+            <w:r>
+              <w:t>2</w:t>
+            </w:r>
+          </w:p>
+        </w:tc>
+        <w:tc>
+          <w:tcPr>
+            <w:tcW w:w="1127" w:type="dxa"/>
+          </w:tcPr>
+          <w:p>
+            <w:r>
+              <w:t>1</w:t>
+            </w:r>
+          </w:p>
+        </w:tc>
+        <w:tc>
+          <w:tcPr>
+            <w:tcW w:w="1721" w:type="dxa"/>
+          </w:tcPr>
+          <w:p>
+            <w:r>
+              <w:t>Frame</w:t>
+            </w:r>
+          </w:p>
+        </w:tc>
+        <w:tc>
+          <w:tcPr>
+            <w:tcW w:w="1180" w:type="dxa"/>
+          </w:tcPr>
+          <w:p>
+            <w:r>
+              <w:t>PLA</w:t>
+            </w:r>
+          </w:p>
+        </w:tc>
+      </w:tr>
+      <w:tr>
+        <w:trPr>
+          <w:trHeight w:val="303"/>
+        </w:trPr>
+        <w:tc>
+          <w:tcPr>
+            <w:tcW w:w="1140" w:type="dxa"/>
+          </w:tcPr>
+          <w:p>
+            <w:r>
+              <w:t>3</w:t>
+            </w:r>
+          </w:p>
+        </w:tc>
+        <w:tc>
+          <w:tcPr>
+            <w:tcW w:w="1127" w:type="dxa"/>
+          </w:tcPr>
+          <w:p>
+            <w:r>
+              <w:t>1</w:t>
+            </w:r>
+          </w:p>
+        </w:tc>
+        <w:tc>
+          <w:tcPr>
+            <w:tcW w:w="1721" w:type="dxa"/>
+          </w:tcPr>
+          <w:p>
+            <w:r>
+              <w:t>Lever</w:t>
+            </w:r>
+          </w:p>
+        </w:tc>
+        <w:tc>
+          <w:tcPr>
+            <w:tcW w:w="1180" w:type="dxa"/>
+          </w:tcPr>
+          <w:p>
+            <w:r>
+              <w:t>PLA</w:t>
+            </w:r>
+          </w:p>
+        </w:tc>
+      </w:tr>
+      <w:tr>
+        <w:trPr>
+          <w:trHeight w:val="322"/>
+        </w:trPr>
+        <w:tc>
+          <w:tcPr>
+            <w:tcW w:w="1140" w:type="dxa"/>
+          </w:tcPr>
+          <w:p>
+            <w:r>
+              <w:t>4</w:t>
+            </w:r>
+          </w:p>
+        </w:tc>
+        <w:tc>
+          <w:tcPr>
+            <w:tcW w:w="1127" w:type="dxa"/>
+          </w:tcPr>
+          <w:p>
+            <w:r>
+              <w:t>2</w:t>
+            </w:r>
+          </w:p>
+        </w:tc>
+        <w:tc>
+          <w:tcPr>
+            <w:tcW w:w="1721" w:type="dxa"/>
+          </w:tcPr>
+          <w:p>
+            <w:r>
+              <w:t>Support Lever</w:t>
+            </w:r>
+          </w:p>
+        </w:tc>
+        <w:tc>
+          <w:tcPr>
+            <w:tcW w:w="1180" w:type="dxa"/>
+          </w:tcPr>
+          <w:p>
+            <w:r>
+              <w:t>PLA</w:t>
+            </w:r>
+          </w:p>
+        </w:tc>
+      </w:tr>
+      <w:tr>
+        <w:trPr>
+          <w:trHeight w:val="322"/>
+        </w:trPr>
+        <w:tc>
+          <w:tcPr>
+            <w:tcW w:w="1140" w:type="dxa"/>
+          </w:tcPr>
+          <w:p>
+            <w:r>
+              <w:t>5</w:t>
+            </w:r>
+          </w:p>
+        </w:tc>
+        <w:tc>
+          <w:tcPr>
+            <w:tcW w:w="1127" w:type="dxa"/>
+          </w:tcPr>
+          <w:p>
+            <w:r>
+              <w:t>4</w:t>
+            </w:r>
+          </w:p>
+        </w:tc>
+        <w:tc>
+          <w:tcPr>
+            <w:tcW w:w="1721" w:type="dxa"/>
+          </w:tcPr>
+          <w:p>
+            <w:r>
+              <w:t>Finger</w:t>
+            </w:r>
+          </w:p>
+        </w:tc>
+        <w:tc>
+          <w:tcPr>
+            <w:tcW w:w="1180" w:type="dxa"/>
+          </w:tcPr>
+          <w:p>
+            <w:r>
+              <w:t>PLA</w:t>
+            </w:r>
+          </w:p>
+        </w:tc>
+      </w:tr>
+      <w:tr>
+        <w:trPr>
+          <w:trHeight w:val="322"/>
+        </w:trPr>
+        <w:tc>
+          <w:tcPr>
+            <w:tcW w:w="1140" w:type="dxa"/>
+          </w:tcPr>
+          <w:p>
+            <w:r>
+              <w:t>6</w:t>
+            </w:r>
+          </w:p>
+        </w:tc>
+        <w:tc>
+          <w:tcPr>
+            <w:tcW w:w="1127" w:type="dxa"/>
+          </w:tcPr>
+          <w:p>
+            <w:r>
+              <w:t>2</w:t>
+            </w:r>
+          </w:p>
+        </w:tc>
+        <w:tc>
+          <w:tcPr>
+            <w:tcW w:w="1721" w:type="dxa"/>
+          </w:tcPr>
+          <w:p>
+            <w:r>
+              <w:t>Tip</w:t>
+            </w:r>
+          </w:p>
+        </w:tc>
+        <w:tc>
+          <w:tcPr>
+            <w:tcW w:w="1180" w:type="dxa"/>
+          </w:tcPr>
+          <w:p>
+            <w:r>
+              <w:t>TPU</w:t>
+            </w:r>
+          </w:p>
+        </w:tc>
+      </w:tr>
+      <w:tr>
+        <w:trPr>
+          <w:trHeight w:val="303"/>
+        </w:trPr>
+        <w:tc>
+          <w:tcPr>
+            <w:tcW w:w="1140" w:type="dxa"/>
+          </w:tcPr>
+          <w:p>
+            <w:r>
+              <w:t>7</w:t>
+            </w:r>
+          </w:p>
+        </w:tc>
+        <w:tc>
+          <w:tcPr>
+            <w:tcW w:w="1127" w:type="dxa"/>
+          </w:tcPr>
+          <w:p>
+            <w:r>
+              <w:t>1</w:t>
+            </w:r>
+          </w:p>
+        </w:tc>
+        <w:tc>
+          <w:tcPr>
+            <w:tcW w:w="1721" w:type="dxa"/>
+          </w:tcPr>
+          <w:p>
+            <w:r>
+              <w:t>Offset Lever</w:t>
+            </w:r>
+          </w:p>
+        </w:tc>
+        <w:tc>
+          <w:tcPr>
+            <w:tcW w:w="1180" w:type="dxa"/>
+          </w:tcPr>
+          <w:p>
+            <w:r>
+              <w:t>PLA</w:t>
+            </w:r>
+          </w:p>
+        </w:tc>
+      </w:tr>
+    </w:tbl>
+    <w:p>
+      <w:pPr>
+        <w:keepNext/>
+      </w:pPr>
+      <w:r>
+        <w:rPr>
+          <w:noProof/>
+        </w:rPr>
+        <w:drawing>
+          <wp:inline distT="0" distB="0" distL="0" distR="0" wp14:anchorId="07733A25" wp14:editId="26A381B5">
+            <wp:extent cx="6296025" cy="3543300"/>
+            <wp:effectExtent l="0" t="0" r="9525" b="0"/>
+            <wp:docPr id="665099943" name="Grafik 2"/>
+            <wp:cNvGraphicFramePr>
+              <a:graphicFrameLocks xmlns:a="http://schemas.openxmlformats.org/drawingml/2006/main" noChangeAspect="1"/>
+            </wp:cNvGraphicFramePr>
+            <a:graphic xmlns:a="http://schemas.openxmlformats.org/drawingml/2006/main">
+              <a:graphicData uri="http://schemas.openxmlformats.org/drawingml/2006/picture">
+                <pic:pic xmlns:pic="http://schemas.openxmlformats.org/drawingml/2006/picture">
+                  <pic:nvPicPr>
+                    <pic:cNvPr id="0" name="Picture 1"/>
+                    <pic:cNvPicPr>
+                      <a:picLocks noChangeAspect="1" noChangeArrowheads="1"/>
+                    </pic:cNvPicPr>
+                  </pic:nvPicPr>
+                  <pic:blipFill>
+                    <a:blip r:embed="rId21" cstate="print">
+                      <a:extLst>
+                        <a:ext uri="{28A0092B-C50C-407E-A947-70E740481C1C}">
+                          <a14:useLocalDpi xmlns:a14="http://schemas.microsoft.com/office/drawing/2010/main" val="0"/>
+                        </a:ext>
+                      </a:extLst>
+                    </a:blip>
+                    <a:srcRect/>
+                    <a:stretch>
+                      <a:fillRect/>
+                    </a:stretch>
+                  </pic:blipFill>
+                  <pic:spPr bwMode="auto">
+                    <a:xfrm>
+                      <a:off x="0" y="0"/>
+                      <a:ext cx="6296025" cy="3543300"/>
+                    </a:xfrm>
+                    <a:prstGeom prst="rect">
+                      <a:avLst/>
+                    </a:prstGeom>
+                    <a:noFill/>
+                    <a:ln>
+                      <a:noFill/>
+                    </a:ln>
+                  </pic:spPr>
+                </pic:pic>
+              </a:graphicData>
+            </a:graphic>
+          </wp:inline>
+        </w:drawing>
+      </w:r>
+    </w:p>
+    <w:p>
+      <w:pPr>
+        <w:pStyle w:val="Beschriftung"/>
+      </w:pPr>
+      <w:bookmarkStart w:id="20" w:name="_Toc190283436"/>
+      <w:proofErr w:type="spellStart"/>
+      <w:r>
+        <w:t>Abbildung</w:t>
+      </w:r>
+      <w:proofErr w:type="spellEnd"/>
+      <w:r>
+        <w:t xml:space="preserve"> </w:t>
+      </w:r>
+      <w:r>
+        <w:fldChar w:fldCharType="begin"/>
+      </w:r>
+      <w:r>
+        <w:instrText xml:space="preserve"> SEQ Abbildung \* ARABIC </w:instrText>
+      </w:r>
+      <w:r>
+        <w:fldChar w:fldCharType="separate"/>
+      </w:r>
+      <w:r>
+        <w:rPr>
+          <w:noProof/>
+        </w:rPr>
+        <w:t>8</w:t>
+      </w:r>
+      <w:r>
+        <w:fldChar w:fldCharType="end"/>
+      </w:r>
+      <w:r>
+        <w:t xml:space="preserve">: Greifer </w:t>
+      </w:r>
+      <w:proofErr w:type="spellStart"/>
+      <w:r>
+        <w:t>Baugruppe</w:t>
+      </w:r>
+      <w:bookmarkEnd w:id="20"/>
+      <w:proofErr w:type="spellEnd"/>
+    </w:p>
     <w:p/>
+    <w:p/>
+    <w:p/>
+    <w:p/>
+    <w:p/>
+    <w:p/>
+    <w:p/>
+    <w:p/>
+    <w:p/>
+    <w:p>
+      <w:pPr>
+        <w:tabs>
+          <w:tab w:val="left" w:pos="3210"/>
+        </w:tabs>
+      </w:pPr>
+      <w:r>
+        <w:tab/>
+      </w:r>
+    </w:p>
+    <w:p>
+      <w:r>
+        <w:br w:type="page"/>
+      </w:r>
+    </w:p>
     <w:p>
       <w:pPr>
         <w:pStyle w:val="berschrift1"/>
       </w:pPr>
-      <w:bookmarkStart w:id="20" w:name="_Toc190272640"/>
-      <w:r>
-        <w:t>Adaption zur Lösung</w:t>
-      </w:r>
-      <w:bookmarkEnd w:id="20"/>
+      <w:r>
+        <w:lastRenderedPageBreak/>
+        <w:t>Ergebnisse FE-Analyse</w:t>
+      </w:r>
+    </w:p>
+    <w:p>
+      <w:r>
+        <w:drawing>
+          <wp:anchor distT="0" distB="0" distL="114300" distR="114300" simplePos="0" relativeHeight="251658240" behindDoc="0" locked="0" layoutInCell="1" allowOverlap="1" wp14:anchorId="05CEA632" wp14:editId="17E8B9AA">
+            <wp:simplePos x="0" y="0"/>
+            <wp:positionH relativeFrom="margin">
+              <wp:align>center</wp:align>
+            </wp:positionH>
+            <wp:positionV relativeFrom="paragraph">
+              <wp:posOffset>1737995</wp:posOffset>
+            </wp:positionV>
+            <wp:extent cx="4427220" cy="4686300"/>
+            <wp:effectExtent l="0" t="0" r="0" b="0"/>
+            <wp:wrapSquare wrapText="bothSides"/>
+            <wp:docPr id="711651583" name="Grafik 1" descr="Ein Bild, das Maschine, Roboter enthält.&#10;&#10;KI-generierte Inhalte können fehlerhaft sein."/>
+            <wp:cNvGraphicFramePr>
+              <a:graphicFrameLocks xmlns:a="http://schemas.openxmlformats.org/drawingml/2006/main" noChangeAspect="1"/>
+            </wp:cNvGraphicFramePr>
+            <a:graphic xmlns:a="http://schemas.openxmlformats.org/drawingml/2006/main">
+              <a:graphicData uri="http://schemas.openxmlformats.org/drawingml/2006/picture">
+                <pic:pic xmlns:pic="http://schemas.openxmlformats.org/drawingml/2006/picture">
+                  <pic:nvPicPr>
+                    <pic:cNvPr id="711651583" name="Grafik 1" descr="Ein Bild, das Maschine, Roboter enthält.&#10;&#10;KI-generierte Inhalte können fehlerhaft sein."/>
+                    <pic:cNvPicPr/>
+                  </pic:nvPicPr>
+                  <pic:blipFill>
+                    <a:blip r:embed="rId22">
+                      <a:extLst>
+                        <a:ext uri="{28A0092B-C50C-407E-A947-70E740481C1C}">
+                          <a14:useLocalDpi xmlns:a14="http://schemas.microsoft.com/office/drawing/2010/main" val="0"/>
+                        </a:ext>
+                      </a:extLst>
+                    </a:blip>
+                    <a:stretch>
+                      <a:fillRect/>
+                    </a:stretch>
+                  </pic:blipFill>
+                  <pic:spPr>
+                    <a:xfrm>
+                      <a:off x="0" y="0"/>
+                      <a:ext cx="4427220" cy="4686300"/>
+                    </a:xfrm>
+                    <a:prstGeom prst="rect">
+                      <a:avLst/>
+                    </a:prstGeom>
+                  </pic:spPr>
+                </pic:pic>
+              </a:graphicData>
+            </a:graphic>
+            <wp14:sizeRelH relativeFrom="page">
+              <wp14:pctWidth>0</wp14:pctWidth>
+            </wp14:sizeRelH>
+            <wp14:sizeRelV relativeFrom="page">
+              <wp14:pctHeight>0</wp14:pctHeight>
+            </wp14:sizeRelV>
+          </wp:anchor>
+        </w:drawing>
+      </w:r>
+      <w:r>
+        <w:rPr>
+          <w:noProof/>
+        </w:rPr>
+        <mc:AlternateContent>
+          <mc:Choice Requires="wps">
+            <w:drawing>
+              <wp:anchor distT="0" distB="0" distL="114300" distR="114300" simplePos="0" relativeHeight="251666432" behindDoc="0" locked="0" layoutInCell="1" allowOverlap="1" wp14:anchorId="4810BE21" wp14:editId="30026857">
+                <wp:simplePos x="0" y="0"/>
+                <wp:positionH relativeFrom="column">
+                  <wp:posOffset>936625</wp:posOffset>
+                </wp:positionH>
+                <wp:positionV relativeFrom="paragraph">
+                  <wp:posOffset>5862320</wp:posOffset>
+                </wp:positionV>
+                <wp:extent cx="4427220" cy="635"/>
+                <wp:effectExtent l="0" t="0" r="0" b="0"/>
+                <wp:wrapSquare wrapText="bothSides"/>
+                <wp:docPr id="743448218" name="Textfeld 1"/>
+                <wp:cNvGraphicFramePr/>
+                <a:graphic xmlns:a="http://schemas.openxmlformats.org/drawingml/2006/main">
+                  <a:graphicData uri="http://schemas.microsoft.com/office/word/2010/wordprocessingShape">
+                    <wps:wsp>
+                      <wps:cNvSpPr txBox="1"/>
+                      <wps:spPr>
+                        <a:xfrm>
+                          <a:off x="0" y="0"/>
+                          <a:ext cx="4427220" cy="635"/>
+                        </a:xfrm>
+                        <a:prstGeom prst="rect">
+                          <a:avLst/>
+                        </a:prstGeom>
+                        <a:solidFill>
+                          <a:prstClr val="white"/>
+                        </a:solidFill>
+                        <a:ln>
+                          <a:noFill/>
+                        </a:ln>
+                      </wps:spPr>
+                      <wps:txbx>
+                        <w:txbxContent>
+                          <w:p>
+                            <w:pPr>
+                              <w:pStyle w:val="Beschriftung"/>
+                              <w:rPr>
+                                <w:sz w:val="22"/>
+                                <w:szCs w:val="22"/>
+                                <w:lang w:val="de-AT"/>
+                              </w:rPr>
+                            </w:pPr>
+                            <w:bookmarkStart w:id="21" w:name="_Toc190283437"/>
+                            <w:r>
+                              <w:rPr>
+                                <w:lang w:val="de-DE"/>
+                              </w:rPr>
+                              <w:t xml:space="preserve">Abbildung </w:t>
+                            </w:r>
+                            <w:r>
+                              <w:fldChar w:fldCharType="begin"/>
+                            </w:r>
+                            <w:r>
+                              <w:rPr>
+                                <w:lang w:val="de-DE"/>
+                              </w:rPr>
+                              <w:instrText xml:space="preserve"> SEQ Abbildung \* ARABIC </w:instrText>
+                            </w:r>
+                            <w:r>
+                              <w:fldChar w:fldCharType="separate"/>
+                            </w:r>
+                            <w:r>
+                              <w:rPr>
+                                <w:noProof/>
+                                <w:lang w:val="de-DE"/>
+                              </w:rPr>
+                              <w:t>9</w:t>
+                            </w:r>
+                            <w:r>
+                              <w:fldChar w:fldCharType="end"/>
+                            </w:r>
+                            <w:r>
+                              <w:rPr>
+                                <w:lang w:val="de-DE"/>
+                              </w:rPr>
+                              <w:t xml:space="preserve">: Simulationskonfiguration der FE-Analyse. </w:t>
+                            </w:r>
+                            <w:r>
+                              <w:rPr>
+                                <w:lang w:val="de-DE"/>
+                              </w:rPr>
+                              <w:t>Greifkraft (dunkel Blau), Reibkraft (Blau), Schwerkraft (Gelb)</w:t>
+                            </w:r>
+                            <w:bookmarkEnd w:id="21"/>
+                          </w:p>
+                        </w:txbxContent>
+                      </wps:txbx>
+                      <wps:bodyPr rot="0" spcFirstLastPara="0" vertOverflow="overflow" horzOverflow="overflow" vert="horz" wrap="square" lIns="0" tIns="0" rIns="0" bIns="0" numCol="1" spcCol="0" rtlCol="0" fromWordArt="0" anchor="t" anchorCtr="0" forceAA="0" compatLnSpc="1">
+                        <a:prstTxWarp prst="textNoShape">
+                          <a:avLst/>
+                        </a:prstTxWarp>
+                        <a:spAutoFit/>
+                      </wps:bodyPr>
+                    </wps:wsp>
+                  </a:graphicData>
+                </a:graphic>
+              </wp:anchor>
+            </w:drawing>
+          </mc:Choice>
+          <mc:Fallback>
+            <w:pict>
+              <v:shapetype w14:anchorId="4810BE21" id="_x0000_t202" coordsize="21600,21600" o:spt="202" path="m,l,21600r21600,l21600,xe">
+                <v:stroke joinstyle="miter"/>
+                <v:path gradientshapeok="t" o:connecttype="rect"/>
+              </v:shapetype>
+              <v:shape id="Textfeld 1" o:spid="_x0000_s1026" type="#_x0000_t202" style="position:absolute;margin-left:73.75pt;margin-top:461.6pt;width:348.6pt;height:.05pt;z-index:251666432;visibility:visible;mso-wrap-style:square;mso-wrap-distance-left:9pt;mso-wrap-distance-top:0;mso-wrap-distance-right:9pt;mso-wrap-distance-bottom:0;mso-position-horizontal:absolute;mso-position-horizontal-relative:text;mso-position-vertical:absolute;mso-position-vertical-relative:text;v-text-anchor:top" o:gfxdata="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" stroked="f">
+                <v:textbox style="mso-fit-shape-to-text:t" inset="0,0,0,0">
+                  <w:txbxContent>
+                    <w:p>
+                      <w:pPr>
+                        <w:pStyle w:val="Beschriftung"/>
+                        <w:rPr>
+                          <w:sz w:val="22"/>
+                          <w:szCs w:val="22"/>
+                          <w:lang w:val="de-AT"/>
+                        </w:rPr>
+                      </w:pPr>
+                      <w:bookmarkStart w:id="22" w:name="_Toc190283437"/>
+                      <w:r>
+                        <w:rPr>
+                          <w:lang w:val="de-DE"/>
+                        </w:rPr>
+                        <w:t xml:space="preserve">Abbildung </w:t>
+                      </w:r>
+                      <w:r>
+                        <w:fldChar w:fldCharType="begin"/>
+                      </w:r>
+                      <w:r>
+                        <w:rPr>
+                          <w:lang w:val="de-DE"/>
+                        </w:rPr>
+                        <w:instrText xml:space="preserve"> SEQ Abbildung \* ARABIC </w:instrText>
+                      </w:r>
+                      <w:r>
+                        <w:fldChar w:fldCharType="separate"/>
+                      </w:r>
+                      <w:r>
+                        <w:rPr>
+                          <w:noProof/>
+                          <w:lang w:val="de-DE"/>
+                        </w:rPr>
+                        <w:t>9</w:t>
+                      </w:r>
+                      <w:r>
+                        <w:fldChar w:fldCharType="end"/>
+                      </w:r>
+                      <w:r>
+                        <w:rPr>
+                          <w:lang w:val="de-DE"/>
+                        </w:rPr>
+                        <w:t xml:space="preserve">: Simulationskonfiguration der FE-Analyse. </w:t>
+                      </w:r>
+                      <w:r>
+                        <w:rPr>
+                          <w:lang w:val="de-DE"/>
+                        </w:rPr>
+                        <w:t>Greifkraft (dunkel Blau), Reibkraft (Blau), Schwerkraft (Gelb)</w:t>
+                      </w:r>
+                      <w:bookmarkEnd w:id="22"/>
+                    </w:p>
+                  </w:txbxContent>
+                </v:textbox>
+                <w10:wrap type="square"/>
+              </v:shape>
+            </w:pict>
+          </mc:Fallback>
+        </mc:AlternateContent>
+      </w:r>
+      <w:r>
+        <w:t xml:space="preserve">In Autodesk Fusion 360 wurde der Lastfall bei geschlossenem Greifer simuliert. Hierbei sind die </w:t>
+      </w:r>
+      <w:proofErr w:type="spellStart"/>
+      <w:r>
+        <w:t>Greiferbacken</w:t>
+      </w:r>
+      <w:proofErr w:type="spellEnd"/>
+      <w:r>
+        <w:t xml:space="preserve"> (</w:t>
+      </w:r>
+      <w:proofErr w:type="spellStart"/>
+      <w:r>
+        <w:t>Tip</w:t>
+      </w:r>
+      <w:proofErr w:type="spellEnd"/>
+      <w:r>
+        <w:t xml:space="preserve">) 42 mm geöffnet. Die Greifkraft von </w:t>
+      </w:r>
+      <w:r>
+        <w:t>12.832 N</w:t>
+      </w:r>
+      <w:r>
+        <w:t xml:space="preserve"> wirkt auf die </w:t>
+      </w:r>
+      <w:proofErr w:type="spellStart"/>
+      <w:r>
+        <w:t>Greiferbacken</w:t>
+      </w:r>
+      <w:proofErr w:type="spellEnd"/>
+      <w:r>
+        <w:t xml:space="preserve">, während die Normalkraft (Reibkraft) des Bauteils an den Oberflächen der </w:t>
+      </w:r>
+      <w:proofErr w:type="spellStart"/>
+      <w:r>
+        <w:t>Greiferbacken</w:t>
+      </w:r>
+      <w:proofErr w:type="spellEnd"/>
+      <w:r>
+        <w:t xml:space="preserve">, durch die Schwerkraft, nach unten wirkt. Da das Bauteil </w:t>
+      </w:r>
+      <w:r>
+        <w:t xml:space="preserve">mit dem Greifer gegriffen und nach oben bewegt wird, ergibt sich mit einer Bewegungsbeschleunigung von 3,84 m/s² eine Reibkraft von </w:t>
+      </w:r>
+      <w:r>
+        <w:t>2.882 N</w:t>
+      </w:r>
+      <w:r>
+        <w:t xml:space="preserve"> pro Greifbacke. Zudem wirkt die Schwerkraft, welche in der FE-Analyse als gelber Pfeil dargestellt ist. </w:t>
+      </w:r>
+      <w:r>
+        <w:br/>
+        <w:t>Weitere Ergebnisse sind der Autodesk.html aus dem Ordner „Dokumentationen und Berechnung zu entnehmen.</w:t>
+      </w:r>
+      <w:r>
+        <w:br/>
+      </w:r>
+      <w:r>
+        <w:br/>
+      </w:r>
     </w:p>
     <w:p/>
+    <w:p/>
+    <w:p/>
+    <w:p/>
+    <w:p/>
+    <w:p/>
+    <w:p/>
+    <w:p/>
+    <w:p/>
+    <w:p/>
+    <w:p/>
+    <w:p/>
+    <w:p/>
+    <w:p/>
+    <w:p/>
+    <w:p/>
+    <w:p/>
+    <w:p/>
+    <w:p/>
+    <w:p/>
+    <w:p/>
+    <w:p/>
+    <w:p/>
+    <w:p/>
+    <w:p/>
+    <w:p>
+      <w:pPr>
+        <w:rPr>
+          <w:rFonts w:eastAsiaTheme="majorEastAsia" w:cstheme="majorBidi"/>
+          <w:color w:val="00649C"/>
+          <w:sz w:val="36"/>
+          <w:szCs w:val="36"/>
+        </w:rPr>
+      </w:pPr>
+      <w:r>
+        <w:rPr>
+          <w:rFonts w:eastAsiaTheme="majorEastAsia" w:cstheme="majorBidi"/>
+          <w:color w:val="00649C"/>
+          <w:sz w:val="36"/>
+          <w:szCs w:val="36"/>
+        </w:rPr>
+        <w:t>Ergebnisse</w:t>
+      </w:r>
+    </w:p>
+    <w:p>
+      <w:r>
+        <w:t>Die Baugruppe wurde auf Dehnung, Spannung und Verschiebung getestet:</w:t>
+      </w:r>
+    </w:p>
+    <w:p/>
+    <w:p>
+      <w:pPr>
+        <w:rPr>
+          <w:rFonts w:eastAsiaTheme="majorEastAsia" w:cstheme="majorBidi"/>
+          <w:color w:val="00649C"/>
+          <w:sz w:val="36"/>
+          <w:szCs w:val="36"/>
+        </w:rPr>
+      </w:pPr>
+      <w:r>
+        <w:rPr>
+          <w:rFonts w:eastAsiaTheme="majorEastAsia" w:cstheme="majorBidi"/>
+          <w:color w:val="00649C"/>
+          <w:sz w:val="36"/>
+          <w:szCs w:val="36"/>
+        </w:rPr>
+        <w:t>Dehnung</w:t>
+      </w:r>
+    </w:p>
+    <w:p>
+      <w:r>
+        <w:rPr>
+          <w:noProof/>
+        </w:rPr>
+        <mc:AlternateContent>
+          <mc:Choice Requires="wps">
+            <w:drawing>
+              <wp:anchor distT="0" distB="0" distL="114300" distR="114300" simplePos="0" relativeHeight="251668480" behindDoc="0" locked="0" layoutInCell="1" allowOverlap="1" wp14:anchorId="19D23ABE" wp14:editId="39021495">
+                <wp:simplePos x="0" y="0"/>
+                <wp:positionH relativeFrom="column">
+                  <wp:posOffset>-1270</wp:posOffset>
+                </wp:positionH>
+                <wp:positionV relativeFrom="paragraph">
+                  <wp:posOffset>4965700</wp:posOffset>
+                </wp:positionV>
+                <wp:extent cx="4740275" cy="635"/>
+                <wp:effectExtent l="0" t="0" r="0" b="0"/>
+                <wp:wrapSquare wrapText="bothSides"/>
+                <wp:docPr id="2079539353" name="Textfeld 1"/>
+                <wp:cNvGraphicFramePr/>
+                <a:graphic xmlns:a="http://schemas.openxmlformats.org/drawingml/2006/main">
+                  <a:graphicData uri="http://schemas.microsoft.com/office/word/2010/wordprocessingShape">
+                    <wps:wsp>
+                      <wps:cNvSpPr txBox="1"/>
+                      <wps:spPr>
+                        <a:xfrm>
+                          <a:off x="0" y="0"/>
+                          <a:ext cx="4740275" cy="635"/>
+                        </a:xfrm>
+                        <a:prstGeom prst="rect">
+                          <a:avLst/>
+                        </a:prstGeom>
+                        <a:solidFill>
+                          <a:prstClr val="white"/>
+                        </a:solidFill>
+                        <a:ln>
+                          <a:noFill/>
+                        </a:ln>
+                      </wps:spPr>
+                      <wps:txbx>
+                        <w:txbxContent>
+                          <w:p>
+                            <w:pPr>
+                              <w:pStyle w:val="Beschriftung"/>
+                              <w:rPr>
+                                <w:noProof/>
+                                <w:sz w:val="22"/>
+                                <w:szCs w:val="22"/>
+                                <w:lang w:val="de-AT"/>
+                              </w:rPr>
+                            </w:pPr>
+                            <w:bookmarkStart w:id="23" w:name="_Toc190283438"/>
+                            <w:r>
+                              <w:rPr>
+                                <w:lang w:val="de-DE"/>
+                              </w:rPr>
+                              <w:t xml:space="preserve">Abbildung </w:t>
+                            </w:r>
+                            <w:r>
+                              <w:fldChar w:fldCharType="begin"/>
+                            </w:r>
+                            <w:r>
+                              <w:rPr>
+                                <w:lang w:val="de-DE"/>
+                              </w:rPr>
+                              <w:instrText xml:space="preserve"> SEQ Abbildung \* ARABIC </w:instrText>
+                            </w:r>
+                            <w:r>
+                              <w:fldChar w:fldCharType="separate"/>
+                            </w:r>
+                            <w:r>
+                              <w:rPr>
+                                <w:noProof/>
+                                <w:lang w:val="de-DE"/>
+                              </w:rPr>
+                              <w:t>10</w:t>
+                            </w:r>
+                            <w:r>
+                              <w:fldChar w:fldCharType="end"/>
+                            </w:r>
+                            <w:r>
+                              <w:rPr>
+                                <w:lang w:val="de-DE"/>
+                              </w:rPr>
+                              <w:t xml:space="preserve">: Ergebnisse für Dehnung der Baugruppe. </w:t>
+                            </w:r>
+                            <w:r>
+                              <w:rPr>
+                                <w:lang w:val="de-DE"/>
+                              </w:rPr>
+                              <w:t>Kritische Stelle</w:t>
+                            </w:r>
+                            <w:r>
+                              <w:rPr>
+                                <w:noProof/>
+                                <w:lang w:val="de-DE"/>
+                              </w:rPr>
+                              <w:t xml:space="preserve"> an beiden Support Lever bei 0.004</w:t>
+                            </w:r>
+                            <w:bookmarkEnd w:id="23"/>
+                          </w:p>
+                        </w:txbxContent>
+                      </wps:txbx>
+                      <wps:bodyPr rot="0" spcFirstLastPara="0" vertOverflow="overflow" horzOverflow="overflow" vert="horz" wrap="square" lIns="0" tIns="0" rIns="0" bIns="0" numCol="1" spcCol="0" rtlCol="0" fromWordArt="0" anchor="t" anchorCtr="0" forceAA="0" compatLnSpc="1">
+                        <a:prstTxWarp prst="textNoShape">
+                          <a:avLst/>
+                        </a:prstTxWarp>
+                        <a:spAutoFit/>
+                      </wps:bodyPr>
+                    </wps:wsp>
+                  </a:graphicData>
+                </a:graphic>
+              </wp:anchor>
+            </w:drawing>
+          </mc:Choice>
+          <mc:Fallback>
+            <w:pict>
+              <v:shape w14:anchorId="19D23ABE" id="_x0000_s1027" type="#_x0000_t202" style="position:absolute;margin-left:-.1pt;margin-top:391pt;width:373.25pt;height:.05pt;z-index:251668480;visibility:visible;mso-wrap-style:square;mso-wrap-distance-left:9pt;mso-wrap-distance-top:0;mso-wrap-distance-right:9pt;mso-wrap-distance-bottom:0;mso-position-horizontal:absolute;mso-position-horizontal-relative:text;mso-position-vertical:absolute;mso-position-vertical-relative:text;v-text-anchor:top" o:gfxdata="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" stroked="f">
+                <v:textbox style="mso-fit-shape-to-text:t" inset="0,0,0,0">
+                  <w:txbxContent>
+                    <w:p>
+                      <w:pPr>
+                        <w:pStyle w:val="Beschriftung"/>
+                        <w:rPr>
+                          <w:noProof/>
+                          <w:sz w:val="22"/>
+                          <w:szCs w:val="22"/>
+                          <w:lang w:val="de-AT"/>
+                        </w:rPr>
+                      </w:pPr>
+                      <w:bookmarkStart w:id="24" w:name="_Toc190283438"/>
+                      <w:r>
+                        <w:rPr>
+                          <w:lang w:val="de-DE"/>
+                        </w:rPr>
+                        <w:t xml:space="preserve">Abbildung </w:t>
+                      </w:r>
+                      <w:r>
+                        <w:fldChar w:fldCharType="begin"/>
+                      </w:r>
+                      <w:r>
+                        <w:rPr>
+                          <w:lang w:val="de-DE"/>
+                        </w:rPr>
+                        <w:instrText xml:space="preserve"> SEQ Abbildung \* ARABIC </w:instrText>
+                      </w:r>
+                      <w:r>
+                        <w:fldChar w:fldCharType="separate"/>
+                      </w:r>
+                      <w:r>
+                        <w:rPr>
+                          <w:noProof/>
+                          <w:lang w:val="de-DE"/>
+                        </w:rPr>
+                        <w:t>10</w:t>
+                      </w:r>
+                      <w:r>
+                        <w:fldChar w:fldCharType="end"/>
+                      </w:r>
+                      <w:r>
+                        <w:rPr>
+                          <w:lang w:val="de-DE"/>
+                        </w:rPr>
+                        <w:t xml:space="preserve">: Ergebnisse für Dehnung der Baugruppe. </w:t>
+                      </w:r>
+                      <w:r>
+                        <w:rPr>
+                          <w:lang w:val="de-DE"/>
+                        </w:rPr>
+                        <w:t>Kritische Stelle</w:t>
+                      </w:r>
+                      <w:r>
+                        <w:rPr>
+                          <w:noProof/>
+                          <w:lang w:val="de-DE"/>
+                        </w:rPr>
+                        <w:t xml:space="preserve"> an beiden Support Lever bei 0.004</w:t>
+                      </w:r>
+                      <w:bookmarkEnd w:id="24"/>
+                    </w:p>
+                  </w:txbxContent>
+                </v:textbox>
+                <w10:wrap type="square"/>
+              </v:shape>
+            </w:pict>
+          </mc:Fallback>
+        </mc:AlternateContent>
+      </w:r>
+      <w:r>
+        <w:rPr>
+          <w:noProof/>
+        </w:rPr>
+        <w:drawing>
+          <wp:anchor distT="0" distB="0" distL="114300" distR="114300" simplePos="0" relativeHeight="251660288" behindDoc="0" locked="0" layoutInCell="1" allowOverlap="1" wp14:anchorId="089D120B" wp14:editId="2D4C09CE">
+            <wp:simplePos x="0" y="0"/>
+            <wp:positionH relativeFrom="column">
+              <wp:posOffset>-1270</wp:posOffset>
+            </wp:positionH>
+            <wp:positionV relativeFrom="paragraph">
+              <wp:posOffset>3175</wp:posOffset>
+            </wp:positionV>
+            <wp:extent cx="4740428" cy="4905375"/>
+            <wp:effectExtent l="0" t="0" r="3175" b="0"/>
+            <wp:wrapSquare wrapText="bothSides"/>
+            <wp:docPr id="1130240093" name="Grafik 3"/>
+            <wp:cNvGraphicFramePr>
+              <a:graphicFrameLocks xmlns:a="http://schemas.openxmlformats.org/drawingml/2006/main" noChangeAspect="1"/>
+            </wp:cNvGraphicFramePr>
+            <a:graphic xmlns:a="http://schemas.openxmlformats.org/drawingml/2006/main">
+              <a:graphicData uri="http://schemas.openxmlformats.org/drawingml/2006/picture">
+                <pic:pic xmlns:pic="http://schemas.openxmlformats.org/drawingml/2006/picture">
+                  <pic:nvPicPr>
+                    <pic:cNvPr id="0" name="Picture 2"/>
+                    <pic:cNvPicPr>
+                      <a:picLocks noChangeAspect="1" noChangeArrowheads="1"/>
+                    </pic:cNvPicPr>
+                  </pic:nvPicPr>
+                  <pic:blipFill>
+                    <a:blip r:embed="rId23">
+                      <a:extLst>
+                        <a:ext uri="{28A0092B-C50C-407E-A947-70E740481C1C}">
+                          <a14:useLocalDpi xmlns:a14="http://schemas.microsoft.com/office/drawing/2010/main" val="0"/>
+                        </a:ext>
+                      </a:extLst>
+                    </a:blip>
+                    <a:srcRect/>
+                    <a:stretch>
+                      <a:fillRect/>
+                    </a:stretch>
+                  </pic:blipFill>
+                  <pic:spPr bwMode="auto">
+                    <a:xfrm>
+                      <a:off x="0" y="0"/>
+                      <a:ext cx="4740428" cy="4905375"/>
+                    </a:xfrm>
+                    <a:prstGeom prst="rect">
+                      <a:avLst/>
+                    </a:prstGeom>
+                    <a:noFill/>
+                    <a:ln>
+                      <a:noFill/>
+                    </a:ln>
+                  </pic:spPr>
+                </pic:pic>
+              </a:graphicData>
+            </a:graphic>
+            <wp14:sizeRelH relativeFrom="page">
+              <wp14:pctWidth>0</wp14:pctWidth>
+            </wp14:sizeRelH>
+            <wp14:sizeRelV relativeFrom="page">
+              <wp14:pctHeight>0</wp14:pctHeight>
+            </wp14:sizeRelV>
+          </wp:anchor>
+        </w:drawing>
+      </w:r>
+    </w:p>
+    <w:p>
+      <w:r>
+        <w:rPr>
+          <w:noProof/>
+        </w:rPr>
+        <w:drawing>
+          <wp:anchor distT="0" distB="0" distL="114300" distR="114300" simplePos="0" relativeHeight="251659264" behindDoc="0" locked="0" layoutInCell="1" allowOverlap="1" wp14:anchorId="71F557E6" wp14:editId="74DFE9F2">
+            <wp:simplePos x="0" y="0"/>
+            <wp:positionH relativeFrom="column">
+              <wp:posOffset>4741545</wp:posOffset>
+            </wp:positionH>
+            <wp:positionV relativeFrom="paragraph">
+              <wp:posOffset>2128520</wp:posOffset>
+            </wp:positionV>
+            <wp:extent cx="1743075" cy="2544445"/>
+            <wp:effectExtent l="0" t="0" r="9525" b="8255"/>
+            <wp:wrapSquare wrapText="bothSides"/>
+            <wp:docPr id="2088772704" name="Grafik 4"/>
+            <wp:cNvGraphicFramePr>
+              <a:graphicFrameLocks xmlns:a="http://schemas.openxmlformats.org/drawingml/2006/main" noChangeAspect="1"/>
+            </wp:cNvGraphicFramePr>
+            <a:graphic xmlns:a="http://schemas.openxmlformats.org/drawingml/2006/main">
+              <a:graphicData uri="http://schemas.openxmlformats.org/drawingml/2006/picture">
+                <pic:pic xmlns:pic="http://schemas.openxmlformats.org/drawingml/2006/picture">
+                  <pic:nvPicPr>
+                    <pic:cNvPr id="0" name="Picture 3"/>
+                    <pic:cNvPicPr>
+                      <a:picLocks noChangeAspect="1" noChangeArrowheads="1"/>
+                    </pic:cNvPicPr>
+                  </pic:nvPicPr>
+                  <pic:blipFill>
+                    <a:blip r:embed="rId24">
+                      <a:extLst>
+                        <a:ext uri="{28A0092B-C50C-407E-A947-70E740481C1C}">
+                          <a14:useLocalDpi xmlns:a14="http://schemas.microsoft.com/office/drawing/2010/main" val="0"/>
+                        </a:ext>
+                      </a:extLst>
+                    </a:blip>
+                    <a:srcRect/>
+                    <a:stretch>
+                      <a:fillRect/>
+                    </a:stretch>
+                  </pic:blipFill>
+                  <pic:spPr bwMode="auto">
+                    <a:xfrm>
+                      <a:off x="0" y="0"/>
+                      <a:ext cx="1743075" cy="2544445"/>
+                    </a:xfrm>
+                    <a:prstGeom prst="rect">
+                      <a:avLst/>
+                    </a:prstGeom>
+                    <a:noFill/>
+                    <a:ln>
+                      <a:noFill/>
+                    </a:ln>
+                  </pic:spPr>
+                </pic:pic>
+              </a:graphicData>
+            </a:graphic>
+            <wp14:sizeRelH relativeFrom="page">
+              <wp14:pctWidth>0</wp14:pctWidth>
+            </wp14:sizeRelH>
+            <wp14:sizeRelV relativeFrom="page">
+              <wp14:pctHeight>0</wp14:pctHeight>
+            </wp14:sizeRelV>
+          </wp:anchor>
+        </w:drawing>
+      </w:r>
+    </w:p>
+    <w:p/>
+    <w:p/>
+    <w:p/>
+    <w:p/>
+    <w:p/>
+    <w:p/>
+    <w:p/>
+    <w:p/>
+    <w:p/>
+    <w:p/>
+    <w:p>
+      <w:pPr>
+        <w:tabs>
+          <w:tab w:val="left" w:pos="1215"/>
+        </w:tabs>
+      </w:pPr>
+      <w:r>
+        <w:tab/>
+      </w:r>
+    </w:p>
     <w:p>
       <w:r>
         <w:br w:type="page"/>
       </w:r>
-      <w:bookmarkStart w:id="21" w:name="_Toc121319663"/>
-      <w:bookmarkStart w:id="22" w:name="_Toc121319739"/>
-      <w:bookmarkStart w:id="23" w:name="_Toc129777481"/>
+    </w:p>
+    <w:p>
+      <w:pPr>
+        <w:rPr>
+          <w:rFonts w:eastAsiaTheme="majorEastAsia" w:cstheme="majorBidi"/>
+          <w:color w:val="00649C"/>
+          <w:sz w:val="36"/>
+          <w:szCs w:val="36"/>
+        </w:rPr>
+      </w:pPr>
+      <w:r>
+        <w:rPr>
+          <w:noProof/>
+        </w:rPr>
+        <w:lastRenderedPageBreak/>
+        <mc:AlternateContent>
+          <mc:Choice Requires="wps">
+            <w:drawing>
+              <wp:anchor distT="0" distB="0" distL="114300" distR="114300" simplePos="0" relativeHeight="251670528" behindDoc="0" locked="0" layoutInCell="1" allowOverlap="1" wp14:anchorId="3C0E8E4F" wp14:editId="1514D262">
+                <wp:simplePos x="0" y="0"/>
+                <wp:positionH relativeFrom="column">
+                  <wp:posOffset>0</wp:posOffset>
+                </wp:positionH>
+                <wp:positionV relativeFrom="paragraph">
+                  <wp:posOffset>5036820</wp:posOffset>
+                </wp:positionV>
+                <wp:extent cx="4410075" cy="635"/>
+                <wp:effectExtent l="0" t="0" r="0" b="0"/>
+                <wp:wrapSquare wrapText="bothSides"/>
+                <wp:docPr id="396688724" name="Textfeld 1"/>
+                <wp:cNvGraphicFramePr/>
+                <a:graphic xmlns:a="http://schemas.openxmlformats.org/drawingml/2006/main">
+                  <a:graphicData uri="http://schemas.microsoft.com/office/word/2010/wordprocessingShape">
+                    <wps:wsp>
+                      <wps:cNvSpPr txBox="1"/>
+                      <wps:spPr>
+                        <a:xfrm>
+                          <a:off x="0" y="0"/>
+                          <a:ext cx="4410075" cy="635"/>
+                        </a:xfrm>
+                        <a:prstGeom prst="rect">
+                          <a:avLst/>
+                        </a:prstGeom>
+                        <a:solidFill>
+                          <a:prstClr val="white"/>
+                        </a:solidFill>
+                        <a:ln>
+                          <a:noFill/>
+                        </a:ln>
+                      </wps:spPr>
+                      <wps:txbx>
+                        <w:txbxContent>
+                          <w:p>
+                            <w:pPr>
+                              <w:pStyle w:val="Beschriftung"/>
+                              <w:rPr>
+                                <w:rFonts w:eastAsiaTheme="majorEastAsia" w:cstheme="majorBidi"/>
+                                <w:noProof/>
+                                <w:color w:val="00649C"/>
+                                <w:sz w:val="36"/>
+                                <w:szCs w:val="36"/>
+                                <w:lang w:val="de-DE"/>
+                              </w:rPr>
+                            </w:pPr>
+                            <w:bookmarkStart w:id="25" w:name="_Toc190283439"/>
+                            <w:r>
+                              <w:rPr>
+                                <w:lang w:val="de-DE"/>
+                              </w:rPr>
+                              <w:t xml:space="preserve">Abbildung </w:t>
+                            </w:r>
+                            <w:r>
+                              <w:fldChar w:fldCharType="begin"/>
+                            </w:r>
+                            <w:r>
+                              <w:rPr>
+                                <w:lang w:val="de-DE"/>
+                              </w:rPr>
+                              <w:instrText xml:space="preserve"> SEQ Abbildung \* ARABIC </w:instrText>
+                            </w:r>
+                            <w:r>
+                              <w:fldChar w:fldCharType="separate"/>
+                            </w:r>
+                            <w:r>
+                              <w:rPr>
+                                <w:noProof/>
+                                <w:lang w:val="de-DE"/>
+                              </w:rPr>
+                              <w:t>11</w:t>
+                            </w:r>
+                            <w:r>
+                              <w:fldChar w:fldCharType="end"/>
+                            </w:r>
+                            <w:r>
+                              <w:rPr>
+                                <w:lang w:val="de-DE"/>
+                              </w:rPr>
+                              <w:t>: Ergebnisse für Spannung in der Baugruppe: Kritische Stelle an Support Lever mit einer Spannung von 7.361</w:t>
+                            </w:r>
+                            <w:r>
+                              <w:rPr>
+                                <w:noProof/>
+                                <w:lang w:val="de-DE"/>
+                              </w:rPr>
+                              <w:t xml:space="preserve"> Mpa</w:t>
+                            </w:r>
+                            <w:bookmarkEnd w:id="25"/>
+                          </w:p>
+                        </w:txbxContent>
+                      </wps:txbx>
+                      <wps:bodyPr rot="0" spcFirstLastPara="0" vertOverflow="overflow" horzOverflow="overflow" vert="horz" wrap="square" lIns="0" tIns="0" rIns="0" bIns="0" numCol="1" spcCol="0" rtlCol="0" fromWordArt="0" anchor="t" anchorCtr="0" forceAA="0" compatLnSpc="1">
+                        <a:prstTxWarp prst="textNoShape">
+                          <a:avLst/>
+                        </a:prstTxWarp>
+                        <a:spAutoFit/>
+                      </wps:bodyPr>
+                    </wps:wsp>
+                  </a:graphicData>
+                </a:graphic>
+              </wp:anchor>
+            </w:drawing>
+          </mc:Choice>
+          <mc:Fallback>
+            <w:pict>
+              <v:shape w14:anchorId="3C0E8E4F" id="_x0000_s1028" type="#_x0000_t202" style="position:absolute;margin-left:0;margin-top:396.6pt;width:347.25pt;height:.05pt;z-index:251670528;visibility:visible;mso-wrap-style:square;mso-wrap-distance-left:9pt;mso-wrap-distance-top:0;mso-wrap-distance-right:9pt;mso-wrap-distance-bottom:0;mso-position-horizontal:absolute;mso-position-horizontal-relative:text;mso-position-vertical:absolute;mso-position-vertical-relative:text;v-text-anchor:top" o:gfxdata="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" stroked="f">
+                <v:textbox style="mso-fit-shape-to-text:t" inset="0,0,0,0">
+                  <w:txbxContent>
+                    <w:p>
+                      <w:pPr>
+                        <w:pStyle w:val="Beschriftung"/>
+                        <w:rPr>
+                          <w:rFonts w:eastAsiaTheme="majorEastAsia" w:cstheme="majorBidi"/>
+                          <w:noProof/>
+                          <w:color w:val="00649C"/>
+                          <w:sz w:val="36"/>
+                          <w:szCs w:val="36"/>
+                          <w:lang w:val="de-DE"/>
+                        </w:rPr>
+                      </w:pPr>
+                      <w:bookmarkStart w:id="26" w:name="_Toc190283439"/>
+                      <w:r>
+                        <w:rPr>
+                          <w:lang w:val="de-DE"/>
+                        </w:rPr>
+                        <w:t xml:space="preserve">Abbildung </w:t>
+                      </w:r>
+                      <w:r>
+                        <w:fldChar w:fldCharType="begin"/>
+                      </w:r>
+                      <w:r>
+                        <w:rPr>
+                          <w:lang w:val="de-DE"/>
+                        </w:rPr>
+                        <w:instrText xml:space="preserve"> SEQ Abbildung \* ARABIC </w:instrText>
+                      </w:r>
+                      <w:r>
+                        <w:fldChar w:fldCharType="separate"/>
+                      </w:r>
+                      <w:r>
+                        <w:rPr>
+                          <w:noProof/>
+                          <w:lang w:val="de-DE"/>
+                        </w:rPr>
+                        <w:t>11</w:t>
+                      </w:r>
+                      <w:r>
+                        <w:fldChar w:fldCharType="end"/>
+                      </w:r>
+                      <w:r>
+                        <w:rPr>
+                          <w:lang w:val="de-DE"/>
+                        </w:rPr>
+                        <w:t>: Ergebnisse für Spannung in der Baugruppe: Kritische Stelle an Support Lever mit einer Spannung von 7.361</w:t>
+                      </w:r>
+                      <w:r>
+                        <w:rPr>
+                          <w:noProof/>
+                          <w:lang w:val="de-DE"/>
+                        </w:rPr>
+                        <w:t xml:space="preserve"> Mpa</w:t>
+                      </w:r>
+                      <w:bookmarkEnd w:id="26"/>
+                    </w:p>
+                  </w:txbxContent>
+                </v:textbox>
+                <w10:wrap type="square"/>
+              </v:shape>
+            </w:pict>
+          </mc:Fallback>
+        </mc:AlternateContent>
+      </w:r>
+      <w:r>
+        <w:rPr>
+          <w:rFonts w:eastAsiaTheme="majorEastAsia" w:cstheme="majorBidi"/>
+          <w:noProof/>
+          <w:color w:val="00649C"/>
+          <w:sz w:val="36"/>
+          <w:szCs w:val="36"/>
+        </w:rPr>
+        <w:drawing>
+          <wp:anchor distT="0" distB="0" distL="114300" distR="114300" simplePos="0" relativeHeight="251661312" behindDoc="0" locked="0" layoutInCell="1" allowOverlap="1" wp14:anchorId="029754AE" wp14:editId="25D302F7">
+            <wp:simplePos x="0" y="0"/>
+            <wp:positionH relativeFrom="margin">
+              <wp:align>left</wp:align>
+            </wp:positionH>
+            <wp:positionV relativeFrom="paragraph">
+              <wp:posOffset>389890</wp:posOffset>
+            </wp:positionV>
+            <wp:extent cx="4410075" cy="4589780"/>
+            <wp:effectExtent l="0" t="0" r="9525" b="1270"/>
+            <wp:wrapSquare wrapText="bothSides"/>
+            <wp:docPr id="348266377" name="Grafik 5"/>
+            <wp:cNvGraphicFramePr>
+              <a:graphicFrameLocks xmlns:a="http://schemas.openxmlformats.org/drawingml/2006/main" noChangeAspect="1"/>
+            </wp:cNvGraphicFramePr>
+            <a:graphic xmlns:a="http://schemas.openxmlformats.org/drawingml/2006/main">
+              <a:graphicData uri="http://schemas.openxmlformats.org/drawingml/2006/picture">
+                <pic:pic xmlns:pic="http://schemas.openxmlformats.org/drawingml/2006/picture">
+                  <pic:nvPicPr>
+                    <pic:cNvPr id="0" name="Picture 4"/>
+                    <pic:cNvPicPr>
+                      <a:picLocks noChangeAspect="1" noChangeArrowheads="1"/>
+                    </pic:cNvPicPr>
+                  </pic:nvPicPr>
+                  <pic:blipFill>
+                    <a:blip r:embed="rId25">
+                      <a:extLst>
+                        <a:ext uri="{28A0092B-C50C-407E-A947-70E740481C1C}">
+                          <a14:useLocalDpi xmlns:a14="http://schemas.microsoft.com/office/drawing/2010/main" val="0"/>
+                        </a:ext>
+                      </a:extLst>
+                    </a:blip>
+                    <a:srcRect/>
+                    <a:stretch>
+                      <a:fillRect/>
+                    </a:stretch>
+                  </pic:blipFill>
+                  <pic:spPr bwMode="auto">
+                    <a:xfrm>
+                      <a:off x="0" y="0"/>
+                      <a:ext cx="4410075" cy="4589780"/>
+                    </a:xfrm>
+                    <a:prstGeom prst="rect">
+                      <a:avLst/>
+                    </a:prstGeom>
+                    <a:noFill/>
+                    <a:ln>
+                      <a:noFill/>
+                    </a:ln>
+                  </pic:spPr>
+                </pic:pic>
+              </a:graphicData>
+            </a:graphic>
+            <wp14:sizeRelH relativeFrom="page">
+              <wp14:pctWidth>0</wp14:pctWidth>
+            </wp14:sizeRelH>
+            <wp14:sizeRelV relativeFrom="page">
+              <wp14:pctHeight>0</wp14:pctHeight>
+            </wp14:sizeRelV>
+          </wp:anchor>
+        </w:drawing>
+      </w:r>
+      <w:r>
+        <w:rPr>
+          <w:rFonts w:eastAsiaTheme="majorEastAsia" w:cstheme="majorBidi"/>
+          <w:color w:val="00649C"/>
+          <w:sz w:val="36"/>
+          <w:szCs w:val="36"/>
+        </w:rPr>
+        <w:t>Spannung</w:t>
+      </w:r>
+    </w:p>
+    <w:p>
+      <w:pPr>
+        <w:rPr>
+          <w:rFonts w:eastAsiaTheme="majorEastAsia" w:cstheme="majorBidi"/>
+          <w:color w:val="00649C"/>
+          <w:sz w:val="36"/>
+          <w:szCs w:val="36"/>
+        </w:rPr>
+      </w:pPr>
+    </w:p>
+    <w:p/>
+    <w:p/>
+    <w:p/>
+    <w:p/>
+    <w:p>
+      <w:r>
+        <w:rPr>
+          <w:noProof/>
+        </w:rPr>
+        <w:drawing>
+          <wp:anchor distT="0" distB="0" distL="114300" distR="114300" simplePos="0" relativeHeight="251662336" behindDoc="0" locked="0" layoutInCell="1" allowOverlap="1" wp14:anchorId="412AFB68" wp14:editId="5B12A1F1">
+            <wp:simplePos x="0" y="0"/>
+            <wp:positionH relativeFrom="margin">
+              <wp:align>right</wp:align>
+            </wp:positionH>
+            <wp:positionV relativeFrom="paragraph">
+              <wp:posOffset>395605</wp:posOffset>
+            </wp:positionV>
+            <wp:extent cx="1842327" cy="2743200"/>
+            <wp:effectExtent l="0" t="0" r="5715" b="0"/>
+            <wp:wrapSquare wrapText="bothSides"/>
+            <wp:docPr id="137037699" name="Grafik 6"/>
+            <wp:cNvGraphicFramePr>
+              <a:graphicFrameLocks xmlns:a="http://schemas.openxmlformats.org/drawingml/2006/main" noChangeAspect="1"/>
+            </wp:cNvGraphicFramePr>
+            <a:graphic xmlns:a="http://schemas.openxmlformats.org/drawingml/2006/main">
+              <a:graphicData uri="http://schemas.openxmlformats.org/drawingml/2006/picture">
+                <pic:pic xmlns:pic="http://schemas.openxmlformats.org/drawingml/2006/picture">
+                  <pic:nvPicPr>
+                    <pic:cNvPr id="0" name="Picture 5"/>
+                    <pic:cNvPicPr>
+                      <a:picLocks noChangeAspect="1" noChangeArrowheads="1"/>
+                    </pic:cNvPicPr>
+                  </pic:nvPicPr>
+                  <pic:blipFill>
+                    <a:blip r:embed="rId26">
+                      <a:extLst>
+                        <a:ext uri="{28A0092B-C50C-407E-A947-70E740481C1C}">
+                          <a14:useLocalDpi xmlns:a14="http://schemas.microsoft.com/office/drawing/2010/main" val="0"/>
+                        </a:ext>
+                      </a:extLst>
+                    </a:blip>
+                    <a:srcRect/>
+                    <a:stretch>
+                      <a:fillRect/>
+                    </a:stretch>
+                  </pic:blipFill>
+                  <pic:spPr bwMode="auto">
+                    <a:xfrm>
+                      <a:off x="0" y="0"/>
+                      <a:ext cx="1842327" cy="2743200"/>
+                    </a:xfrm>
+                    <a:prstGeom prst="rect">
+                      <a:avLst/>
+                    </a:prstGeom>
+                    <a:noFill/>
+                    <a:ln>
+                      <a:noFill/>
+                    </a:ln>
+                  </pic:spPr>
+                </pic:pic>
+              </a:graphicData>
+            </a:graphic>
+          </wp:anchor>
+        </w:drawing>
+      </w:r>
+    </w:p>
+    <w:p/>
+    <w:p/>
+    <w:p/>
+    <w:p/>
+    <w:p>
+      <w:pPr>
+        <w:tabs>
+          <w:tab w:val="left" w:pos="3165"/>
+        </w:tabs>
+      </w:pPr>
+      <w:r>
+        <w:tab/>
+      </w:r>
+    </w:p>
+    <w:p>
+      <w:r>
+        <w:br w:type="page"/>
+      </w:r>
+    </w:p>
+    <w:p>
+      <w:pPr>
+        <w:rPr>
+          <w:rFonts w:eastAsiaTheme="majorEastAsia" w:cstheme="majorBidi"/>
+          <w:color w:val="00649C"/>
+          <w:sz w:val="36"/>
+          <w:szCs w:val="36"/>
+        </w:rPr>
+      </w:pPr>
+      <w:r>
+        <w:rPr>
+          <w:noProof/>
+        </w:rPr>
+        <w:lastRenderedPageBreak/>
+        <mc:AlternateContent>
+          <mc:Choice Requires="wps">
+            <w:drawing>
+              <wp:anchor distT="0" distB="0" distL="114300" distR="114300" simplePos="0" relativeHeight="251672576" behindDoc="0" locked="0" layoutInCell="1" allowOverlap="1" wp14:anchorId="1DA7675D" wp14:editId="7B7D444F">
+                <wp:simplePos x="0" y="0"/>
+                <wp:positionH relativeFrom="column">
+                  <wp:posOffset>0</wp:posOffset>
+                </wp:positionH>
+                <wp:positionV relativeFrom="paragraph">
+                  <wp:posOffset>5304790</wp:posOffset>
+                </wp:positionV>
+                <wp:extent cx="4428490" cy="635"/>
+                <wp:effectExtent l="0" t="0" r="0" b="0"/>
+                <wp:wrapSquare wrapText="bothSides"/>
+                <wp:docPr id="561202001" name="Textfeld 1"/>
+                <wp:cNvGraphicFramePr/>
+                <a:graphic xmlns:a="http://schemas.openxmlformats.org/drawingml/2006/main">
+                  <a:graphicData uri="http://schemas.microsoft.com/office/word/2010/wordprocessingShape">
+                    <wps:wsp>
+                      <wps:cNvSpPr txBox="1"/>
+                      <wps:spPr>
+                        <a:xfrm>
+                          <a:off x="0" y="0"/>
+                          <a:ext cx="4428490" cy="635"/>
+                        </a:xfrm>
+                        <a:prstGeom prst="rect">
+                          <a:avLst/>
+                        </a:prstGeom>
+                        <a:solidFill>
+                          <a:prstClr val="white"/>
+                        </a:solidFill>
+                        <a:ln>
+                          <a:noFill/>
+                        </a:ln>
+                      </wps:spPr>
+                      <wps:txbx>
+                        <w:txbxContent>
+                          <w:p>
+                            <w:pPr>
+                              <w:pStyle w:val="Beschriftung"/>
+                              <w:rPr>
+                                <w:rFonts w:eastAsiaTheme="majorEastAsia" w:cstheme="majorBidi"/>
+                                <w:noProof/>
+                                <w:color w:val="00649C"/>
+                                <w:sz w:val="36"/>
+                                <w:szCs w:val="36"/>
+                                <w:lang w:val="de-DE"/>
+                              </w:rPr>
+                            </w:pPr>
+                            <w:bookmarkStart w:id="27" w:name="_Toc190283440"/>
+                            <w:r>
+                              <w:rPr>
+                                <w:lang w:val="de-DE"/>
+                              </w:rPr>
+                              <w:t xml:space="preserve">Abbildung </w:t>
+                            </w:r>
+                            <w:r>
+                              <w:fldChar w:fldCharType="begin"/>
+                            </w:r>
+                            <w:r>
+                              <w:rPr>
+                                <w:lang w:val="de-DE"/>
+                              </w:rPr>
+                              <w:instrText xml:space="preserve"> SEQ Abbildung \* ARABIC </w:instrText>
+                            </w:r>
+                            <w:r>
+                              <w:fldChar w:fldCharType="separate"/>
+                            </w:r>
+                            <w:r>
+                              <w:rPr>
+                                <w:noProof/>
+                                <w:lang w:val="de-DE"/>
+                              </w:rPr>
+                              <w:t>12</w:t>
+                            </w:r>
+                            <w:r>
+                              <w:fldChar w:fldCharType="end"/>
+                            </w:r>
+                            <w:r>
+                              <w:rPr>
+                                <w:lang w:val="de-DE"/>
+                              </w:rPr>
+                              <w:t xml:space="preserve">: Ergebnisse für Verschiebung in der Baugruppe: Kritische Stelle an </w:t>
+                            </w:r>
+                            <w:proofErr w:type="spellStart"/>
+                            <w:r>
+                              <w:rPr>
+                                <w:lang w:val="de-DE"/>
+                              </w:rPr>
+                              <w:t>Greiferbacken</w:t>
+                            </w:r>
+                            <w:proofErr w:type="spellEnd"/>
+                            <w:r>
+                              <w:rPr>
+                                <w:lang w:val="de-DE"/>
+                              </w:rPr>
+                              <w:t xml:space="preserve"> (</w:t>
+                            </w:r>
+                            <w:proofErr w:type="spellStart"/>
+                            <w:r>
+                              <w:rPr>
+                                <w:lang w:val="de-DE"/>
+                              </w:rPr>
+                              <w:t>Tip</w:t>
+                            </w:r>
+                            <w:proofErr w:type="spellEnd"/>
+                            <w:r>
+                              <w:rPr>
+                                <w:lang w:val="de-DE"/>
+                              </w:rPr>
+                              <w:t xml:space="preserve">) mit 0.26 mm. Die </w:t>
+                            </w:r>
+                            <w:proofErr w:type="spellStart"/>
+                            <w:r>
+                              <w:rPr>
+                                <w:lang w:val="de-DE"/>
+                              </w:rPr>
+                              <w:t>Greiferbacken</w:t>
+                            </w:r>
+                            <w:proofErr w:type="spellEnd"/>
+                            <w:r>
+                              <w:rPr>
+                                <w:lang w:val="de-DE"/>
+                              </w:rPr>
+                              <w:t xml:space="preserve"> sind aus TPU, weshalb die Größe Verschiebung an den </w:t>
+                            </w:r>
+                            <w:proofErr w:type="spellStart"/>
+                            <w:r>
+                              <w:rPr>
+                                <w:lang w:val="de-DE"/>
+                              </w:rPr>
+                              <w:t>Greiferbacken</w:t>
+                            </w:r>
+                            <w:proofErr w:type="spellEnd"/>
+                            <w:r>
+                              <w:rPr>
+                                <w:lang w:val="de-DE"/>
+                              </w:rPr>
+                              <w:t xml:space="preserve"> auftritt.</w:t>
+                            </w:r>
+                            <w:bookmarkEnd w:id="27"/>
+                          </w:p>
+                        </w:txbxContent>
+                      </wps:txbx>
+                      <wps:bodyPr rot="0" spcFirstLastPara="0" vertOverflow="overflow" horzOverflow="overflow" vert="horz" wrap="square" lIns="0" tIns="0" rIns="0" bIns="0" numCol="1" spcCol="0" rtlCol="0" fromWordArt="0" anchor="t" anchorCtr="0" forceAA="0" compatLnSpc="1">
+                        <a:prstTxWarp prst="textNoShape">
+                          <a:avLst/>
+                        </a:prstTxWarp>
+                        <a:spAutoFit/>
+                      </wps:bodyPr>
+                    </wps:wsp>
+                  </a:graphicData>
+                </a:graphic>
+              </wp:anchor>
+            </w:drawing>
+          </mc:Choice>
+          <mc:Fallback>
+            <w:pict>
+              <v:shape w14:anchorId="1DA7675D" id="_x0000_s1029" type="#_x0000_t202" style="position:absolute;margin-left:0;margin-top:417.7pt;width:348.7pt;height:.05pt;z-index:251672576;visibility:visible;mso-wrap-style:square;mso-wrap-distance-left:9pt;mso-wrap-distance-top:0;mso-wrap-distance-right:9pt;mso-wrap-distance-bottom:0;mso-position-horizontal:absolute;mso-position-horizontal-relative:text;mso-position-vertical:absolute;mso-position-vertical-relative:text;v-text-anchor:top" o:gfxdata="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" stroked="f">
+                <v:textbox style="mso-fit-shape-to-text:t" inset="0,0,0,0">
+                  <w:txbxContent>
+                    <w:p>
+                      <w:pPr>
+                        <w:pStyle w:val="Beschriftung"/>
+                        <w:rPr>
+                          <w:rFonts w:eastAsiaTheme="majorEastAsia" w:cstheme="majorBidi"/>
+                          <w:noProof/>
+                          <w:color w:val="00649C"/>
+                          <w:sz w:val="36"/>
+                          <w:szCs w:val="36"/>
+                          <w:lang w:val="de-DE"/>
+                        </w:rPr>
+                      </w:pPr>
+                      <w:bookmarkStart w:id="28" w:name="_Toc190283440"/>
+                      <w:r>
+                        <w:rPr>
+                          <w:lang w:val="de-DE"/>
+                        </w:rPr>
+                        <w:t xml:space="preserve">Abbildung </w:t>
+                      </w:r>
+                      <w:r>
+                        <w:fldChar w:fldCharType="begin"/>
+                      </w:r>
+                      <w:r>
+                        <w:rPr>
+                          <w:lang w:val="de-DE"/>
+                        </w:rPr>
+                        <w:instrText xml:space="preserve"> SEQ Abbildung \* ARABIC </w:instrText>
+                      </w:r>
+                      <w:r>
+                        <w:fldChar w:fldCharType="separate"/>
+                      </w:r>
+                      <w:r>
+                        <w:rPr>
+                          <w:noProof/>
+                          <w:lang w:val="de-DE"/>
+                        </w:rPr>
+                        <w:t>12</w:t>
+                      </w:r>
+                      <w:r>
+                        <w:fldChar w:fldCharType="end"/>
+                      </w:r>
+                      <w:r>
+                        <w:rPr>
+                          <w:lang w:val="de-DE"/>
+                        </w:rPr>
+                        <w:t xml:space="preserve">: Ergebnisse für Verschiebung in der Baugruppe: Kritische Stelle an </w:t>
+                      </w:r>
+                      <w:proofErr w:type="spellStart"/>
+                      <w:r>
+                        <w:rPr>
+                          <w:lang w:val="de-DE"/>
+                        </w:rPr>
+                        <w:t>Greiferbacken</w:t>
+                      </w:r>
+                      <w:proofErr w:type="spellEnd"/>
+                      <w:r>
+                        <w:rPr>
+                          <w:lang w:val="de-DE"/>
+                        </w:rPr>
+                        <w:t xml:space="preserve"> (</w:t>
+                      </w:r>
+                      <w:proofErr w:type="spellStart"/>
+                      <w:r>
+                        <w:rPr>
+                          <w:lang w:val="de-DE"/>
+                        </w:rPr>
+                        <w:t>Tip</w:t>
+                      </w:r>
+                      <w:proofErr w:type="spellEnd"/>
+                      <w:r>
+                        <w:rPr>
+                          <w:lang w:val="de-DE"/>
+                        </w:rPr>
+                        <w:t xml:space="preserve">) mit 0.26 mm. Die </w:t>
+                      </w:r>
+                      <w:proofErr w:type="spellStart"/>
+                      <w:r>
+                        <w:rPr>
+                          <w:lang w:val="de-DE"/>
+                        </w:rPr>
+                        <w:t>Greiferbacken</w:t>
+                      </w:r>
+                      <w:proofErr w:type="spellEnd"/>
+                      <w:r>
+                        <w:rPr>
+                          <w:lang w:val="de-DE"/>
+                        </w:rPr>
+                        <w:t xml:space="preserve"> sind aus TPU, weshalb die Größe Verschiebung an den </w:t>
+                      </w:r>
+                      <w:proofErr w:type="spellStart"/>
+                      <w:r>
+                        <w:rPr>
+                          <w:lang w:val="de-DE"/>
+                        </w:rPr>
+                        <w:t>Greiferbacken</w:t>
+                      </w:r>
+                      <w:proofErr w:type="spellEnd"/>
+                      <w:r>
+                        <w:rPr>
+                          <w:lang w:val="de-DE"/>
+                        </w:rPr>
+                        <w:t xml:space="preserve"> auftritt.</w:t>
+                      </w:r>
+                      <w:bookmarkEnd w:id="28"/>
+                    </w:p>
+                  </w:txbxContent>
+                </v:textbox>
+                <w10:wrap type="square"/>
+              </v:shape>
+            </w:pict>
+          </mc:Fallback>
+        </mc:AlternateContent>
+      </w:r>
+      <w:r>
+        <w:rPr>
+          <w:rFonts w:eastAsiaTheme="majorEastAsia" w:cstheme="majorBidi"/>
+          <w:noProof/>
+          <w:color w:val="00649C"/>
+          <w:sz w:val="36"/>
+          <w:szCs w:val="36"/>
+        </w:rPr>
+        <w:drawing>
+          <wp:anchor distT="0" distB="0" distL="114300" distR="114300" simplePos="0" relativeHeight="251663360" behindDoc="0" locked="0" layoutInCell="1" allowOverlap="1" wp14:anchorId="12B8DC66" wp14:editId="2F08B5FF">
+            <wp:simplePos x="0" y="0"/>
+            <wp:positionH relativeFrom="margin">
+              <wp:align>left</wp:align>
+            </wp:positionH>
+            <wp:positionV relativeFrom="paragraph">
+              <wp:posOffset>389890</wp:posOffset>
+            </wp:positionV>
+            <wp:extent cx="4428490" cy="4857750"/>
+            <wp:effectExtent l="0" t="0" r="0" b="0"/>
+            <wp:wrapSquare wrapText="bothSides"/>
+            <wp:docPr id="1859985411" name="Grafik 7"/>
+            <wp:cNvGraphicFramePr>
+              <a:graphicFrameLocks xmlns:a="http://schemas.openxmlformats.org/drawingml/2006/main" noChangeAspect="1"/>
+            </wp:cNvGraphicFramePr>
+            <a:graphic xmlns:a="http://schemas.openxmlformats.org/drawingml/2006/main">
+              <a:graphicData uri="http://schemas.openxmlformats.org/drawingml/2006/picture">
+                <pic:pic xmlns:pic="http://schemas.openxmlformats.org/drawingml/2006/picture">
+                  <pic:nvPicPr>
+                    <pic:cNvPr id="0" name="Picture 6"/>
+                    <pic:cNvPicPr>
+                      <a:picLocks noChangeAspect="1" noChangeArrowheads="1"/>
+                    </pic:cNvPicPr>
+                  </pic:nvPicPr>
+                  <pic:blipFill>
+                    <a:blip r:embed="rId27">
+                      <a:extLst>
+                        <a:ext uri="{28A0092B-C50C-407E-A947-70E740481C1C}">
+                          <a14:useLocalDpi xmlns:a14="http://schemas.microsoft.com/office/drawing/2010/main" val="0"/>
+                        </a:ext>
+                      </a:extLst>
+                    </a:blip>
+                    <a:srcRect/>
+                    <a:stretch>
+                      <a:fillRect/>
+                    </a:stretch>
+                  </pic:blipFill>
+                  <pic:spPr bwMode="auto">
+                    <a:xfrm>
+                      <a:off x="0" y="0"/>
+                      <a:ext cx="4428490" cy="4857750"/>
+                    </a:xfrm>
+                    <a:prstGeom prst="rect">
+                      <a:avLst/>
+                    </a:prstGeom>
+                    <a:noFill/>
+                    <a:ln>
+                      <a:noFill/>
+                    </a:ln>
+                  </pic:spPr>
+                </pic:pic>
+              </a:graphicData>
+            </a:graphic>
+            <wp14:sizeRelH relativeFrom="page">
+              <wp14:pctWidth>0</wp14:pctWidth>
+            </wp14:sizeRelH>
+            <wp14:sizeRelV relativeFrom="page">
+              <wp14:pctHeight>0</wp14:pctHeight>
+            </wp14:sizeRelV>
+          </wp:anchor>
+        </w:drawing>
+      </w:r>
+      <w:r>
+        <w:rPr>
+          <w:rFonts w:eastAsiaTheme="majorEastAsia" w:cstheme="majorBidi"/>
+          <w:color w:val="00649C"/>
+          <w:sz w:val="36"/>
+          <w:szCs w:val="36"/>
+        </w:rPr>
+        <w:t>Verschiebung</w:t>
+      </w:r>
+    </w:p>
+    <w:p>
+      <w:pPr>
+        <w:rPr>
+          <w:rFonts w:eastAsiaTheme="majorEastAsia" w:cstheme="majorBidi"/>
+          <w:color w:val="00649C"/>
+          <w:sz w:val="36"/>
+          <w:szCs w:val="36"/>
+        </w:rPr>
+      </w:pPr>
+    </w:p>
+    <w:p>
+      <w:r>
+        <w:rPr>
+          <w:rFonts w:eastAsiaTheme="majorEastAsia" w:cstheme="majorBidi"/>
+          <w:noProof/>
+          <w:color w:val="00649C"/>
+          <w:sz w:val="36"/>
+          <w:szCs w:val="36"/>
+        </w:rPr>
+        <w:drawing>
+          <wp:anchor distT="0" distB="0" distL="114300" distR="114300" simplePos="0" relativeHeight="251664384" behindDoc="0" locked="0" layoutInCell="1" allowOverlap="1" wp14:anchorId="37DD573A" wp14:editId="7519445C">
+            <wp:simplePos x="0" y="0"/>
+            <wp:positionH relativeFrom="column">
+              <wp:posOffset>4551680</wp:posOffset>
+            </wp:positionH>
+            <wp:positionV relativeFrom="paragraph">
+              <wp:posOffset>1677670</wp:posOffset>
+            </wp:positionV>
+            <wp:extent cx="1714500" cy="2743200"/>
+            <wp:effectExtent l="0" t="0" r="0" b="0"/>
+            <wp:wrapSquare wrapText="bothSides"/>
+            <wp:docPr id="640682719" name="Grafik 8"/>
+            <wp:cNvGraphicFramePr>
+              <a:graphicFrameLocks xmlns:a="http://schemas.openxmlformats.org/drawingml/2006/main" noChangeAspect="1"/>
+            </wp:cNvGraphicFramePr>
+            <a:graphic xmlns:a="http://schemas.openxmlformats.org/drawingml/2006/main">
+              <a:graphicData uri="http://schemas.openxmlformats.org/drawingml/2006/picture">
+                <pic:pic xmlns:pic="http://schemas.openxmlformats.org/drawingml/2006/picture">
+                  <pic:nvPicPr>
+                    <pic:cNvPr id="0" name="Picture 7"/>
+                    <pic:cNvPicPr>
+                      <a:picLocks noChangeAspect="1" noChangeArrowheads="1"/>
+                    </pic:cNvPicPr>
+                  </pic:nvPicPr>
+                  <pic:blipFill>
+                    <a:blip r:embed="rId28">
+                      <a:extLst>
+                        <a:ext uri="{28A0092B-C50C-407E-A947-70E740481C1C}">
+                          <a14:useLocalDpi xmlns:a14="http://schemas.microsoft.com/office/drawing/2010/main" val="0"/>
+                        </a:ext>
+                      </a:extLst>
+                    </a:blip>
+                    <a:srcRect/>
+                    <a:stretch>
+                      <a:fillRect/>
+                    </a:stretch>
+                  </pic:blipFill>
+                  <pic:spPr bwMode="auto">
+                    <a:xfrm>
+                      <a:off x="0" y="0"/>
+                      <a:ext cx="1714500" cy="2743200"/>
+                    </a:xfrm>
+                    <a:prstGeom prst="rect">
+                      <a:avLst/>
+                    </a:prstGeom>
+                    <a:noFill/>
+                    <a:ln>
+                      <a:noFill/>
+                    </a:ln>
+                  </pic:spPr>
+                </pic:pic>
+              </a:graphicData>
+            </a:graphic>
+            <wp14:sizeRelH relativeFrom="page">
+              <wp14:pctWidth>0</wp14:pctWidth>
+            </wp14:sizeRelH>
+            <wp14:sizeRelV relativeFrom="page">
+              <wp14:pctHeight>0</wp14:pctHeight>
+            </wp14:sizeRelV>
+          </wp:anchor>
+        </w:drawing>
+      </w:r>
+    </w:p>
+    <w:p/>
+    <w:p/>
+    <w:p/>
+    <w:p/>
+    <w:p/>
+    <w:p/>
+    <w:p/>
+    <w:p/>
+    <w:p/>
+    <w:p>
+      <w:pPr>
+        <w:rPr>
+          <w:rFonts w:eastAsiaTheme="majorEastAsia" w:cstheme="majorBidi"/>
+          <w:color w:val="00649C"/>
+          <w:sz w:val="36"/>
+          <w:szCs w:val="36"/>
+        </w:rPr>
+      </w:pPr>
+      <w:r>
+        <w:rPr>
+          <w:rFonts w:eastAsiaTheme="majorEastAsia" w:cstheme="majorBidi"/>
+          <w:color w:val="00649C"/>
+          <w:sz w:val="36"/>
+          <w:szCs w:val="36"/>
+        </w:rPr>
+        <w:t>Sicherheitsfaktor:</w:t>
+      </w:r>
+    </w:p>
+    <w:p>
+      <w:pPr>
+        <w:keepNext/>
+      </w:pPr>
+      <w:r>
+        <w:drawing>
+          <wp:inline distT="0" distB="0" distL="0" distR="0" wp14:anchorId="2A85315D" wp14:editId="1DAFCF01">
+            <wp:extent cx="1473967" cy="1924500"/>
+            <wp:effectExtent l="0" t="0" r="0" b="0"/>
+            <wp:docPr id="162844349" name="Grafik 1" descr="Ein Bild, das Text, Screenshot, Diagramm, Reihe enthält.&#10;&#10;KI-generierte Inhalte können fehlerhaft sein."/>
+            <wp:cNvGraphicFramePr>
+              <a:graphicFrameLocks xmlns:a="http://schemas.openxmlformats.org/drawingml/2006/main" noChangeAspect="1"/>
+            </wp:cNvGraphicFramePr>
+            <a:graphic xmlns:a="http://schemas.openxmlformats.org/drawingml/2006/main">
+              <a:graphicData uri="http://schemas.openxmlformats.org/drawingml/2006/picture">
+                <pic:pic xmlns:pic="http://schemas.openxmlformats.org/drawingml/2006/picture">
+                  <pic:nvPicPr>
+                    <pic:cNvPr id="162844349" name="Grafik 1" descr="Ein Bild, das Text, Screenshot, Diagramm, Reihe enthält.&#10;&#10;KI-generierte Inhalte können fehlerhaft sein."/>
+                    <pic:cNvPicPr/>
+                  </pic:nvPicPr>
+                  <pic:blipFill>
+                    <a:blip r:embed="rId29"/>
+                    <a:stretch>
+                      <a:fillRect/>
+                    </a:stretch>
+                  </pic:blipFill>
+                  <pic:spPr>
+                    <a:xfrm>
+                      <a:off x="0" y="0"/>
+                      <a:ext cx="1473967" cy="1924500"/>
+                    </a:xfrm>
+                    <a:prstGeom prst="rect">
+                      <a:avLst/>
+                    </a:prstGeom>
+                  </pic:spPr>
+                </pic:pic>
+              </a:graphicData>
+            </a:graphic>
+          </wp:inline>
+        </w:drawing>
+      </w:r>
+    </w:p>
+    <w:p>
+      <w:pPr>
+        <w:pStyle w:val="Beschriftung"/>
+      </w:pPr>
+      <w:bookmarkStart w:id="29" w:name="_Toc190283441"/>
+      <w:r>
+        <w:rPr>
+          <w:lang w:val="de-DE"/>
+        </w:rPr>
+        <w:t xml:space="preserve">Abbildung </w:t>
+      </w:r>
+      <w:r>
+        <w:fldChar w:fldCharType="begin"/>
+      </w:r>
+      <w:r>
+        <w:rPr>
+          <w:lang w:val="de-DE"/>
+        </w:rPr>
+        <w:instrText xml:space="preserve"> SEQ Abbildung \* ARABIC </w:instrText>
+      </w:r>
+      <w:r>
+        <w:fldChar w:fldCharType="separate"/>
+      </w:r>
+      <w:r>
+        <w:rPr>
+          <w:noProof/>
+          <w:lang w:val="de-DE"/>
+        </w:rPr>
+        <w:t>13</w:t>
+      </w:r>
+      <w:r>
+        <w:fldChar w:fldCharType="end"/>
+      </w:r>
+      <w:r>
+        <w:rPr>
+          <w:lang w:val="de-DE"/>
+        </w:rPr>
+        <w:t>: Der Sicherheitsfaktor ergibt sich bei einem Minimum von 6.725</w:t>
+      </w:r>
+      <w:bookmarkEnd w:id="29"/>
+    </w:p>
+    <w:p>
+      <w:r>
+        <w:br w:type="page"/>
+      </w:r>
+      <w:bookmarkStart w:id="30" w:name="_Toc121319663"/>
+      <w:bookmarkStart w:id="31" w:name="_Toc121319739"/>
+      <w:bookmarkStart w:id="32" w:name="_Toc129777481"/>
       <w:r>
         <w:lastRenderedPageBreak/>
         <w:t>Abbildungsverzeichnis</w:t>
       </w:r>
-      <w:bookmarkEnd w:id="21"/>
-      <w:bookmarkEnd w:id="22"/>
-      <w:bookmarkEnd w:id="23"/>
+      <w:bookmarkEnd w:id="30"/>
+      <w:bookmarkEnd w:id="31"/>
+      <w:bookmarkEnd w:id="32"/>
     </w:p>
     <w:p>
       <w:pPr>
@@ -2360,7 +4525,7 @@
           <w:kern w:val="2"/>
           <w:sz w:val="24"/>
           <w:szCs w:val="24"/>
-          <w:lang w:eastAsia="de-AT"/>
+          <w:lang w:val="de-DE" w:eastAsia="de-DE"/>
           <w14:ligatures w14:val="standardContextual"/>
         </w:rPr>
       </w:pPr>
@@ -2373,7 +4538,7 @@
       <w:r>
         <w:fldChar w:fldCharType="separate"/>
       </w:r>
-      <w:hyperlink w:anchor="_Toc190271938" w:history="1">
+      <w:hyperlink w:anchor="_Toc190283429" w:history="1">
         <w:r>
           <w:rPr>
             <w:rStyle w:val="Hyperlink"/>
@@ -2400,7 +4565,7 @@
             <w:noProof/>
             <w:webHidden/>
           </w:rPr>
-          <w:instrText xml:space="preserve"> PAGEREF _Toc190271938 \h </w:instrText>
+          <w:instrText xml:space="preserve"> PAGEREF _Toc190283429 \h </w:instrText>
         </w:r>
         <w:r>
           <w:rPr>
@@ -2443,11 +4608,11 @@
           <w:kern w:val="2"/>
           <w:sz w:val="24"/>
           <w:szCs w:val="24"/>
-          <w:lang w:eastAsia="de-AT"/>
+          <w:lang w:val="de-DE" w:eastAsia="de-DE"/>
           <w14:ligatures w14:val="standardContextual"/>
         </w:rPr>
       </w:pPr>
-      <w:hyperlink w:anchor="_Toc190271939" w:history="1">
+      <w:hyperlink w:anchor="_Toc190283430" w:history="1">
         <w:r>
           <w:rPr>
             <w:rStyle w:val="Hyperlink"/>
@@ -2474,7 +4639,7 @@
             <w:noProof/>
             <w:webHidden/>
           </w:rPr>
-          <w:instrText xml:space="preserve"> PAGEREF _Toc190271939 \h </w:instrText>
+          <w:instrText xml:space="preserve"> PAGEREF _Toc190283430 \h </w:instrText>
         </w:r>
         <w:r>
           <w:rPr>
@@ -2517,11 +4682,11 @@
           <w:kern w:val="2"/>
           <w:sz w:val="24"/>
           <w:szCs w:val="24"/>
-          <w:lang w:eastAsia="de-AT"/>
+          <w:lang w:val="de-DE" w:eastAsia="de-DE"/>
           <w14:ligatures w14:val="standardContextual"/>
         </w:rPr>
       </w:pPr>
-      <w:hyperlink w:anchor="_Toc190271940" w:history="1">
+      <w:hyperlink w:anchor="_Toc190283431" w:history="1">
         <w:r>
           <w:rPr>
             <w:rStyle w:val="Hyperlink"/>
@@ -2548,7 +4713,7 @@
             <w:noProof/>
             <w:webHidden/>
           </w:rPr>
-          <w:instrText xml:space="preserve"> PAGEREF _Toc190271940 \h </w:instrText>
+          <w:instrText xml:space="preserve"> PAGEREF _Toc190283431 \h </w:instrText>
         </w:r>
         <w:r>
           <w:rPr>
@@ -2591,11 +4756,11 @@
           <w:kern w:val="2"/>
           <w:sz w:val="24"/>
           <w:szCs w:val="24"/>
-          <w:lang w:eastAsia="de-AT"/>
+          <w:lang w:val="de-DE" w:eastAsia="de-DE"/>
           <w14:ligatures w14:val="standardContextual"/>
         </w:rPr>
       </w:pPr>
-      <w:hyperlink w:anchor="_Toc190271941" w:history="1">
+      <w:hyperlink w:anchor="_Toc190283432" w:history="1">
         <w:r>
           <w:rPr>
             <w:rStyle w:val="Hyperlink"/>
@@ -2622,7 +4787,7 @@
             <w:noProof/>
             <w:webHidden/>
           </w:rPr>
-          <w:instrText xml:space="preserve"> PAGEREF _Toc190271941 \h </w:instrText>
+          <w:instrText xml:space="preserve"> PAGEREF _Toc190283432 \h </w:instrText>
         </w:r>
         <w:r>
           <w:rPr>
@@ -2665,11 +4830,11 @@
           <w:kern w:val="2"/>
           <w:sz w:val="24"/>
           <w:szCs w:val="24"/>
-          <w:lang w:eastAsia="de-AT"/>
+          <w:lang w:val="de-DE" w:eastAsia="de-DE"/>
           <w14:ligatures w14:val="standardContextual"/>
         </w:rPr>
       </w:pPr>
-      <w:hyperlink w:anchor="_Toc190271942" w:history="1">
+      <w:hyperlink w:anchor="_Toc190283433" w:history="1">
         <w:r>
           <w:rPr>
             <w:rStyle w:val="Hyperlink"/>
@@ -2696,7 +4861,7 @@
             <w:noProof/>
             <w:webHidden/>
           </w:rPr>
-          <w:instrText xml:space="preserve"> PAGEREF _Toc190271942 \h </w:instrText>
+          <w:instrText xml:space="preserve"> PAGEREF _Toc190283433 \h </w:instrText>
         </w:r>
         <w:r>
           <w:rPr>
@@ -2739,11 +4904,11 @@
           <w:kern w:val="2"/>
           <w:sz w:val="24"/>
           <w:szCs w:val="24"/>
-          <w:lang w:eastAsia="de-AT"/>
+          <w:lang w:val="de-DE" w:eastAsia="de-DE"/>
           <w14:ligatures w14:val="standardContextual"/>
         </w:rPr>
       </w:pPr>
-      <w:hyperlink w:anchor="_Toc190271943" w:history="1">
+      <w:hyperlink w:anchor="_Toc190283434" w:history="1">
         <w:r>
           <w:rPr>
             <w:rStyle w:val="Hyperlink"/>
@@ -2770,7 +4935,7 @@
             <w:noProof/>
             <w:webHidden/>
           </w:rPr>
-          <w:instrText xml:space="preserve"> PAGEREF _Toc190271943 \h </w:instrText>
+          <w:instrText xml:space="preserve"> PAGEREF _Toc190283434 \h </w:instrText>
         </w:r>
         <w:r>
           <w:rPr>
@@ -2813,11 +4978,11 @@
           <w:kern w:val="2"/>
           <w:sz w:val="24"/>
           <w:szCs w:val="24"/>
-          <w:lang w:eastAsia="de-AT"/>
+          <w:lang w:val="de-DE" w:eastAsia="de-DE"/>
           <w14:ligatures w14:val="standardContextual"/>
         </w:rPr>
       </w:pPr>
-      <w:hyperlink w:anchor="_Toc190271944" w:history="1">
+      <w:hyperlink w:anchor="_Toc190283435" w:history="1">
         <w:r>
           <w:rPr>
             <w:rStyle w:val="Hyperlink"/>
@@ -2844,7 +5009,7 @@
             <w:noProof/>
             <w:webHidden/>
           </w:rPr>
-          <w:instrText xml:space="preserve"> PAGEREF _Toc190271944 \h </w:instrText>
+          <w:instrText xml:space="preserve"> PAGEREF _Toc190283435 \h </w:instrText>
         </w:r>
         <w:r>
           <w:rPr>
@@ -2876,6 +5041,455 @@
       </w:hyperlink>
     </w:p>
     <w:p>
+      <w:pPr>
+        <w:pStyle w:val="Abbildungsverzeichnis"/>
+        <w:tabs>
+          <w:tab w:val="right" w:pos="9912"/>
+        </w:tabs>
+        <w:rPr>
+          <w:rFonts w:asciiTheme="minorHAnsi" w:eastAsiaTheme="minorEastAsia" w:hAnsiTheme="minorHAnsi"/>
+          <w:noProof/>
+          <w:kern w:val="2"/>
+          <w:sz w:val="24"/>
+          <w:szCs w:val="24"/>
+          <w:lang w:val="de-DE" w:eastAsia="de-DE"/>
+          <w14:ligatures w14:val="standardContextual"/>
+        </w:rPr>
+      </w:pPr>
+      <w:hyperlink w:anchor="_Toc190283436" w:history="1">
+        <w:r>
+          <w:rPr>
+            <w:rStyle w:val="Hyperlink"/>
+            <w:noProof/>
+          </w:rPr>
+          <w:t>Abbildung 8: Greifer Baugruppe</w:t>
+        </w:r>
+        <w:r>
+          <w:rPr>
+            <w:noProof/>
+            <w:webHidden/>
+          </w:rPr>
+          <w:tab/>
+        </w:r>
+        <w:r>
+          <w:rPr>
+            <w:noProof/>
+            <w:webHidden/>
+          </w:rPr>
+          <w:fldChar w:fldCharType="begin"/>
+        </w:r>
+        <w:r>
+          <w:rPr>
+            <w:noProof/>
+            <w:webHidden/>
+          </w:rPr>
+          <w:instrText xml:space="preserve"> PAGEREF _Toc190283436 \h </w:instrText>
+        </w:r>
+        <w:r>
+          <w:rPr>
+            <w:noProof/>
+            <w:webHidden/>
+          </w:rPr>
+        </w:r>
+        <w:r>
+          <w:rPr>
+            <w:noProof/>
+            <w:webHidden/>
+          </w:rPr>
+          <w:fldChar w:fldCharType="separate"/>
+        </w:r>
+        <w:r>
+          <w:rPr>
+            <w:noProof/>
+            <w:webHidden/>
+          </w:rPr>
+          <w:t>11</w:t>
+        </w:r>
+        <w:r>
+          <w:rPr>
+            <w:noProof/>
+            <w:webHidden/>
+          </w:rPr>
+          <w:fldChar w:fldCharType="end"/>
+        </w:r>
+      </w:hyperlink>
+    </w:p>
+    <w:p>
+      <w:pPr>
+        <w:pStyle w:val="Abbildungsverzeichnis"/>
+        <w:tabs>
+          <w:tab w:val="right" w:pos="9912"/>
+        </w:tabs>
+        <w:rPr>
+          <w:rFonts w:asciiTheme="minorHAnsi" w:eastAsiaTheme="minorEastAsia" w:hAnsiTheme="minorHAnsi"/>
+          <w:noProof/>
+          <w:kern w:val="2"/>
+          <w:sz w:val="24"/>
+          <w:szCs w:val="24"/>
+          <w:lang w:val="de-DE" w:eastAsia="de-DE"/>
+          <w14:ligatures w14:val="standardContextual"/>
+        </w:rPr>
+      </w:pPr>
+      <w:hyperlink w:anchor="_Toc190283437" w:history="1">
+        <w:r>
+          <w:rPr>
+            <w:rStyle w:val="Hyperlink"/>
+            <w:noProof/>
+            <w:lang w:val="de-DE"/>
+          </w:rPr>
+          <w:t>Abbildung 9: Simulationskonfiguration der FE-Analyse. Greifkraft (dunkel Blau), Reibkraft (Blau), Schwerkraft (Gelb)</w:t>
+        </w:r>
+        <w:r>
+          <w:rPr>
+            <w:noProof/>
+            <w:webHidden/>
+          </w:rPr>
+          <w:tab/>
+        </w:r>
+        <w:r>
+          <w:rPr>
+            <w:noProof/>
+            <w:webHidden/>
+          </w:rPr>
+          <w:fldChar w:fldCharType="begin"/>
+        </w:r>
+        <w:r>
+          <w:rPr>
+            <w:noProof/>
+            <w:webHidden/>
+          </w:rPr>
+          <w:instrText xml:space="preserve"> PAGEREF _Toc190283437 \h </w:instrText>
+        </w:r>
+        <w:r>
+          <w:rPr>
+            <w:noProof/>
+            <w:webHidden/>
+          </w:rPr>
+        </w:r>
+        <w:r>
+          <w:rPr>
+            <w:noProof/>
+            <w:webHidden/>
+          </w:rPr>
+          <w:fldChar w:fldCharType="separate"/>
+        </w:r>
+        <w:r>
+          <w:rPr>
+            <w:noProof/>
+            <w:webHidden/>
+          </w:rPr>
+          <w:t>12</w:t>
+        </w:r>
+        <w:r>
+          <w:rPr>
+            <w:noProof/>
+            <w:webHidden/>
+          </w:rPr>
+          <w:fldChar w:fldCharType="end"/>
+        </w:r>
+      </w:hyperlink>
+    </w:p>
+    <w:p>
+      <w:pPr>
+        <w:pStyle w:val="Abbildungsverzeichnis"/>
+        <w:tabs>
+          <w:tab w:val="right" w:pos="9912"/>
+        </w:tabs>
+        <w:rPr>
+          <w:rFonts w:asciiTheme="minorHAnsi" w:eastAsiaTheme="minorEastAsia" w:hAnsiTheme="minorHAnsi"/>
+          <w:noProof/>
+          <w:kern w:val="2"/>
+          <w:sz w:val="24"/>
+          <w:szCs w:val="24"/>
+          <w:lang w:val="de-DE" w:eastAsia="de-DE"/>
+          <w14:ligatures w14:val="standardContextual"/>
+        </w:rPr>
+      </w:pPr>
+      <w:hyperlink w:anchor="_Toc190283438" w:history="1">
+        <w:r>
+          <w:rPr>
+            <w:rStyle w:val="Hyperlink"/>
+            <w:noProof/>
+            <w:lang w:val="de-DE"/>
+          </w:rPr>
+          <w:t>Abbildung 10: Ergebnisse für Dehnung der Baugruppe. Kritische Stelle an beiden Support Lever bei 0.004</w:t>
+        </w:r>
+        <w:r>
+          <w:rPr>
+            <w:noProof/>
+            <w:webHidden/>
+          </w:rPr>
+          <w:tab/>
+        </w:r>
+        <w:r>
+          <w:rPr>
+            <w:noProof/>
+            <w:webHidden/>
+          </w:rPr>
+          <w:fldChar w:fldCharType="begin"/>
+        </w:r>
+        <w:r>
+          <w:rPr>
+            <w:noProof/>
+            <w:webHidden/>
+          </w:rPr>
+          <w:instrText xml:space="preserve"> PAGEREF _Toc190283438 \h </w:instrText>
+        </w:r>
+        <w:r>
+          <w:rPr>
+            <w:noProof/>
+            <w:webHidden/>
+          </w:rPr>
+        </w:r>
+        <w:r>
+          <w:rPr>
+            <w:noProof/>
+            <w:webHidden/>
+          </w:rPr>
+          <w:fldChar w:fldCharType="separate"/>
+        </w:r>
+        <w:r>
+          <w:rPr>
+            <w:noProof/>
+            <w:webHidden/>
+          </w:rPr>
+          <w:t>13</w:t>
+        </w:r>
+        <w:r>
+          <w:rPr>
+            <w:noProof/>
+            <w:webHidden/>
+          </w:rPr>
+          <w:fldChar w:fldCharType="end"/>
+        </w:r>
+      </w:hyperlink>
+    </w:p>
+    <w:p>
+      <w:pPr>
+        <w:pStyle w:val="Abbildungsverzeichnis"/>
+        <w:tabs>
+          <w:tab w:val="right" w:pos="9912"/>
+        </w:tabs>
+        <w:rPr>
+          <w:rFonts w:asciiTheme="minorHAnsi" w:eastAsiaTheme="minorEastAsia" w:hAnsiTheme="minorHAnsi"/>
+          <w:noProof/>
+          <w:kern w:val="2"/>
+          <w:sz w:val="24"/>
+          <w:szCs w:val="24"/>
+          <w:lang w:val="de-DE" w:eastAsia="de-DE"/>
+          <w14:ligatures w14:val="standardContextual"/>
+        </w:rPr>
+      </w:pPr>
+      <w:hyperlink w:anchor="_Toc190283439" w:history="1">
+        <w:r>
+          <w:rPr>
+            <w:rStyle w:val="Hyperlink"/>
+            <w:noProof/>
+            <w:lang w:val="de-DE"/>
+          </w:rPr>
+          <w:t>Abbildung 11: Ergebnisse für Spannung in der Baugruppe: Kritische Stelle an Support Lever mit einer Spannung von 7.361 Mpa</w:t>
+        </w:r>
+        <w:r>
+          <w:rPr>
+            <w:noProof/>
+            <w:webHidden/>
+          </w:rPr>
+          <w:tab/>
+        </w:r>
+        <w:r>
+          <w:rPr>
+            <w:noProof/>
+            <w:webHidden/>
+          </w:rPr>
+          <w:fldChar w:fldCharType="begin"/>
+        </w:r>
+        <w:r>
+          <w:rPr>
+            <w:noProof/>
+            <w:webHidden/>
+          </w:rPr>
+          <w:instrText xml:space="preserve"> PAGEREF _Toc190283439 \h </w:instrText>
+        </w:r>
+        <w:r>
+          <w:rPr>
+            <w:noProof/>
+            <w:webHidden/>
+          </w:rPr>
+        </w:r>
+        <w:r>
+          <w:rPr>
+            <w:noProof/>
+            <w:webHidden/>
+          </w:rPr>
+          <w:fldChar w:fldCharType="separate"/>
+        </w:r>
+        <w:r>
+          <w:rPr>
+            <w:noProof/>
+            <w:webHidden/>
+          </w:rPr>
+          <w:t>14</w:t>
+        </w:r>
+        <w:r>
+          <w:rPr>
+            <w:noProof/>
+            <w:webHidden/>
+          </w:rPr>
+          <w:fldChar w:fldCharType="end"/>
+        </w:r>
+      </w:hyperlink>
+    </w:p>
+    <w:p>
+      <w:pPr>
+        <w:pStyle w:val="Abbildungsverzeichnis"/>
+        <w:tabs>
+          <w:tab w:val="right" w:pos="9912"/>
+        </w:tabs>
+        <w:rPr>
+          <w:rFonts w:asciiTheme="minorHAnsi" w:eastAsiaTheme="minorEastAsia" w:hAnsiTheme="minorHAnsi"/>
+          <w:noProof/>
+          <w:kern w:val="2"/>
+          <w:sz w:val="24"/>
+          <w:szCs w:val="24"/>
+          <w:lang w:val="de-DE" w:eastAsia="de-DE"/>
+          <w14:ligatures w14:val="standardContextual"/>
+        </w:rPr>
+      </w:pPr>
+      <w:hyperlink w:anchor="_Toc190283440" w:history="1">
+        <w:r>
+          <w:rPr>
+            <w:rStyle w:val="Hyperlink"/>
+            <w:noProof/>
+            <w:lang w:val="de-DE"/>
+          </w:rPr>
+          <w:t>Abbildung 12: Ergebnisse für Verschiebung in der Baugruppe: Kritische Stelle an Greiferbacken (Tip) mit 0.26 mm. Die Greiferbacken sind aus TPU, weshalb die Größe Verschiebung an den Greiferbacken auftritt.</w:t>
+        </w:r>
+        <w:r>
+          <w:rPr>
+            <w:noProof/>
+            <w:webHidden/>
+          </w:rPr>
+          <w:tab/>
+        </w:r>
+        <w:r>
+          <w:rPr>
+            <w:noProof/>
+            <w:webHidden/>
+          </w:rPr>
+          <w:fldChar w:fldCharType="begin"/>
+        </w:r>
+        <w:r>
+          <w:rPr>
+            <w:noProof/>
+            <w:webHidden/>
+          </w:rPr>
+          <w:instrText xml:space="preserve"> PAGEREF _Toc190283440 \h </w:instrText>
+        </w:r>
+        <w:r>
+          <w:rPr>
+            <w:noProof/>
+            <w:webHidden/>
+          </w:rPr>
+        </w:r>
+        <w:r>
+          <w:rPr>
+            <w:noProof/>
+            <w:webHidden/>
+          </w:rPr>
+          <w:fldChar w:fldCharType="separate"/>
+        </w:r>
+        <w:r>
+          <w:rPr>
+            <w:noProof/>
+            <w:webHidden/>
+          </w:rPr>
+          <w:t>15</w:t>
+        </w:r>
+        <w:r>
+          <w:rPr>
+            <w:noProof/>
+            <w:webHidden/>
+          </w:rPr>
+          <w:fldChar w:fldCharType="end"/>
+        </w:r>
+      </w:hyperlink>
+    </w:p>
+    <w:p>
+      <w:pPr>
+        <w:pStyle w:val="Abbildungsverzeichnis"/>
+        <w:tabs>
+          <w:tab w:val="right" w:pos="9912"/>
+        </w:tabs>
+        <w:rPr>
+          <w:rFonts w:asciiTheme="minorHAnsi" w:eastAsiaTheme="minorEastAsia" w:hAnsiTheme="minorHAnsi"/>
+          <w:noProof/>
+          <w:kern w:val="2"/>
+          <w:sz w:val="24"/>
+          <w:szCs w:val="24"/>
+          <w:lang w:val="de-DE" w:eastAsia="de-DE"/>
+          <w14:ligatures w14:val="standardContextual"/>
+        </w:rPr>
+      </w:pPr>
+      <w:hyperlink w:anchor="_Toc190283441" w:history="1">
+        <w:r>
+          <w:rPr>
+            <w:rStyle w:val="Hyperlink"/>
+            <w:noProof/>
+            <w:lang w:val="de-DE"/>
+          </w:rPr>
+          <w:t>Abbildung 13: Der Sicherheitsfaktor ergibt sich bei einem Minimum von 6.725</w:t>
+        </w:r>
+        <w:r>
+          <w:rPr>
+            <w:noProof/>
+            <w:webHidden/>
+          </w:rPr>
+          <w:tab/>
+        </w:r>
+        <w:r>
+          <w:rPr>
+            <w:noProof/>
+            <w:webHidden/>
+          </w:rPr>
+          <w:fldChar w:fldCharType="begin"/>
+        </w:r>
+        <w:r>
+          <w:rPr>
+            <w:noProof/>
+            <w:webHidden/>
+          </w:rPr>
+          <w:instrText xml:space="preserve"> PAGEREF _Toc190283441 \h </w:instrText>
+        </w:r>
+        <w:r>
+          <w:rPr>
+            <w:noProof/>
+            <w:webHidden/>
+          </w:rPr>
+        </w:r>
+        <w:r>
+          <w:rPr>
+            <w:noProof/>
+            <w:webHidden/>
+          </w:rPr>
+          <w:fldChar w:fldCharType="separate"/>
+        </w:r>
+        <w:r>
+          <w:rPr>
+            <w:noProof/>
+            <w:webHidden/>
+          </w:rPr>
+          <w:t>15</w:t>
+        </w:r>
+        <w:r>
+          <w:rPr>
+            <w:noProof/>
+            <w:webHidden/>
+          </w:rPr>
+          <w:fldChar w:fldCharType="end"/>
+        </w:r>
+      </w:hyperlink>
+    </w:p>
+    <w:p>
       <w:r>
         <w:fldChar w:fldCharType="end"/>
       </w:r>
@@ -2887,26 +5501,24 @@
       <w:pPr>
         <w:pStyle w:val="berschrift1"/>
         <w:rPr>
-          <w:lang w:val="en-NZ"/>
-        </w:rPr>
-      </w:pPr>
-      <w:bookmarkStart w:id="24" w:name="_Toc121319664"/>
-      <w:bookmarkStart w:id="25" w:name="_Toc121319741"/>
-      <w:bookmarkStart w:id="26" w:name="_Toc129777483"/>
-      <w:bookmarkStart w:id="27" w:name="_Toc190272641"/>
-      <w:proofErr w:type="spellStart"/>
-      <w:r>
-        <w:rPr>
-          <w:lang w:val="en-NZ"/>
+          <w:lang w:val="de-DE"/>
+        </w:rPr>
+      </w:pPr>
+      <w:bookmarkStart w:id="33" w:name="_Toc121319664"/>
+      <w:bookmarkStart w:id="34" w:name="_Toc121319741"/>
+      <w:bookmarkStart w:id="35" w:name="_Toc129777483"/>
+      <w:bookmarkStart w:id="36" w:name="_Toc190272641"/>
+      <w:r>
+        <w:rPr>
+          <w:lang w:val="de-DE"/>
         </w:rPr>
         <w:lastRenderedPageBreak/>
         <w:t>Literaturverzeichnis</w:t>
       </w:r>
-      <w:bookmarkEnd w:id="24"/>
-      <w:bookmarkEnd w:id="25"/>
-      <w:bookmarkEnd w:id="26"/>
-      <w:bookmarkEnd w:id="27"/>
-      <w:proofErr w:type="spellEnd"/>
+      <w:bookmarkEnd w:id="33"/>
+      <w:bookmarkEnd w:id="34"/>
+      <w:bookmarkEnd w:id="35"/>
+      <w:bookmarkEnd w:id="36"/>
     </w:p>
     <w:sdt>
       <w:sdtPr>
@@ -2944,11 +5556,11 @@
           <w:r>
             <w:tab/>
           </w:r>
-          <w:bookmarkStart w:id="28" w:name="_CTVL001ae33295acf7542409c55cac3d6c3a523"/>
+          <w:bookmarkStart w:id="37" w:name="_CTVL001ae33295acf7542409c55cac3d6c3a523"/>
           <w:r>
             <w:t>Gomeringer, R., Kilgus, R., Menges, V</w:t>
           </w:r>
-          <w:bookmarkEnd w:id="28"/>
+          <w:bookmarkEnd w:id="37"/>
           <w:r>
             <w:t>.</w:t>
           </w:r>
@@ -2959,15 +5571,7 @@
             <w:t>, et al.</w:t>
           </w:r>
           <w:r>
-            <w:t xml:space="preserve">: ‘Tabellenbuch Metall: Mit Formelsammlung’ (Verlag Europa-Lehrmittel Nourney Vollmer GmbH &amp; Co. KG, Haan-Gruiten, 2024, 49th </w:t>
-          </w:r>
-          <w:proofErr w:type="spellStart"/>
-          <w:r>
-            <w:t>edn</w:t>
-          </w:r>
-          <w:proofErr w:type="spellEnd"/>
-          <w:r>
-            <w:t>.)</w:t>
+            <w:t>: ‘Tabellenbuch Metall: Mit Formelsammlung’ (Verlag Europa-Lehrmittel Nourney Vollmer GmbH &amp; Co. KG, Haan-Gruiten, 2024, 49th edn.)</w:t>
           </w:r>
           <w:r>
             <w:fldChar w:fldCharType="end"/>
@@ -2977,12 +5581,12 @@
     </w:sdt>
     <w:p/>
     <w:sectPr>
-      <w:headerReference w:type="even" r:id="rId21"/>
-      <w:headerReference w:type="default" r:id="rId22"/>
-      <w:footerReference w:type="even" r:id="rId23"/>
-      <w:footerReference w:type="default" r:id="rId24"/>
-      <w:headerReference w:type="first" r:id="rId25"/>
-      <w:footerReference w:type="first" r:id="rId26"/>
+      <w:headerReference w:type="even" r:id="rId30"/>
+      <w:headerReference w:type="default" r:id="rId31"/>
+      <w:footerReference w:type="even" r:id="rId32"/>
+      <w:footerReference w:type="default" r:id="rId33"/>
+      <w:headerReference w:type="first" r:id="rId34"/>
+      <w:footerReference w:type="first" r:id="rId35"/>
       <w:pgSz w:w="11906" w:h="16838" w:code="9"/>
       <w:pgMar w:top="992" w:right="992" w:bottom="992" w:left="992" w:header="709" w:footer="709" w:gutter="0"/>
       <w:cols w:space="708"/>
@@ -4533,6 +7137,7 @@
   <w:style w:type="character" w:default="1" w:styleId="Absatz-Standardschriftart">
     <w:name w:val="Default Paragraph Font"/>
     <w:uiPriority w:val="1"/>
+    <w:semiHidden/>
     <w:unhideWhenUsed/>
   </w:style>
   <w:style w:type="table" w:default="1" w:styleId="NormaleTabelle">
@@ -5410,10 +8015,12 @@
     <w:rsid w:val="002E1E29"/>
     <w:rsid w:val="00570805"/>
     <w:rsid w:val="007144EC"/>
+    <w:rsid w:val="009B0860"/>
     <w:rsid w:val="00AB71BE"/>
     <w:rsid w:val="00B86A8E"/>
     <w:rsid w:val="00F25329"/>
     <w:rsid w:val="00FA6919"/>
+    <w:rsid w:val="00FD1E93"/>
   </w:rsids>
   <m:mathPr>
     <m:mathFont m:val="Cambria Math"/>
@@ -6148,7 +8755,32 @@
 </a:theme>
 </file>
 
-<file path=customXml/item1.xml><?xml version="1.0" encoding="utf-8"?>
+<file path=customXml/item1.xml>��< ? x m l   v e r s i o n = " 1 . 0 "   e n c o d i n g = " u t f - 1 6 " ? > < D o c u m e n t S e t t i n g s   x m l n s : x s i = " h t t p : / / w w w . w 3 . o r g / 2 0 0 1 / X M L S c h e m a - i n s t a n c e "   x m l n s : x s d = " h t t p : / / w w w . w 3 . o r g / 2 0 0 1 / X M L S c h e m a "   x m l n s = " h t t p : / / w w w . z h a w . c h / A c c e s s i b i l i t y A d d I n " > + 
+     < C h e c k H e a d i n g H i e r a r c h y > t r u e < / C h e c k H e a d i n g H i e r a r c h y > + 
+     < C h e c k R e a d i n g O r d e r > f a l s e < / C h e c k R e a d i n g O r d e r > + 
+     < C h e c k T a b l e H e a d e r > t r u e < / C h e c k T a b l e H e a d e r > + 
+     < C h e c k D o c T i t l e > t r u e < / C h e c k D o c T i t l e > + 
+     < C h e c k L a n g u a g e S e t t i n g > t r u e < / C h e c k L a n g u a g e S e t t i n g > + 
+     < C h e c k A l t T e x t > t r u e < / C h e c k A l t T e x t > + 
+     < C h e c k T e x t S i z e > f a l s e < / C h e c k T e x t S i z e > + 
+     < C h e c k S c r e e n T i p > t r u e < / C h e c k S c r e e n T i p > + 
+     < S h o w S h a p e N a m e C o l u m n > f a l s e < / S h o w S h a p e N a m e C o l u m n > + 
+     < S h o w I s s u e D e s c r i p t i o n > t r u e < / S h o w I s s u e D e s c r i p t i o n > + 
+ < / D o c u m e n t S e t t i n g s > 
+</file>
+
+<file path=customXml/item2.xml><?xml version="1.0" encoding="utf-8"?>
 <b:Sources xmlns:b="http://schemas.openxmlformats.org/officeDocument/2006/bibliography" xmlns="http://schemas.openxmlformats.org/officeDocument/2006/bibliography" SelectedStyle="\APASixthEditionOfficeOnline.xsl" StyleName="APA" Version="6">
   <b:Source>
     <b:Tag>Zit22</b:Tag>
@@ -6189,44 +8821,19 @@
 </b:Sources>
 </file>
 
-<file path=customXml/item2.xml>��< ? x m l   v e r s i o n = " 1 . 0 "   e n c o d i n g = " u t f - 1 6 " ? > < D o c u m e n t S e t t i n g s   x m l n s : x s i = " h t t p : / / w w w . w 3 . o r g / 2 0 0 1 / X M L S c h e m a - i n s t a n c e "   x m l n s : x s d = " h t t p : / / w w w . w 3 . o r g / 2 0 0 1 / X M L S c h e m a "   x m l n s = " h t t p : / / w w w . z h a w . c h / A c c e s s i b i l i t y A d d I n " > - 
-     < C h e c k H e a d i n g H i e r a r c h y > t r u e < / C h e c k H e a d i n g H i e r a r c h y > - 
-     < C h e c k R e a d i n g O r d e r > f a l s e < / C h e c k R e a d i n g O r d e r > - 
-     < C h e c k T a b l e H e a d e r > t r u e < / C h e c k T a b l e H e a d e r > - 
-     < C h e c k D o c T i t l e > t r u e < / C h e c k D o c T i t l e > - 
-     < C h e c k L a n g u a g e S e t t i n g > t r u e < / C h e c k L a n g u a g e S e t t i n g > - 
-     < C h e c k A l t T e x t > t r u e < / C h e c k A l t T e x t > - 
-     < C h e c k T e x t S i z e > f a l s e < / C h e c k T e x t S i z e > - 
-     < C h e c k S c r e e n T i p > t r u e < / C h e c k S c r e e n T i p > - 
-     < S h o w S h a p e N a m e C o l u m n > f a l s e < / S h o w S h a p e N a m e C o l u m n > - 
-     < S h o w I s s u e D e s c r i p t i o n > t r u e < / S h o w I s s u e D e s c r i p t i o n > - 
- < / D o c u m e n t S e t t i n g s > 
-</file>
-
 <file path=customXml/itemProps1.xml><?xml version="1.0" encoding="utf-8"?>
-<ds:datastoreItem xmlns:ds="http://schemas.openxmlformats.org/officeDocument/2006/customXml" ds:itemID="{82881D81-B07A-40A3-826B-39C868CF3A6B}">
-  <ds:schemaRefs>
-    <ds:schemaRef ds:uri="http://schemas.openxmlformats.org/officeDocument/2006/bibliography"/>
-  </ds:schemaRefs>
-</ds:datastoreItem>
-</file>
-
-<file path=customXml/itemProps2.xml><?xml version="1.0" encoding="utf-8"?>
 <ds:datastoreItem xmlns:ds="http://schemas.openxmlformats.org/officeDocument/2006/customXml" ds:itemID="{A2071FAF-8228-4A81-8C02-DF3837FABB5E}">
   <ds:schemaRefs>
     <ds:schemaRef ds:uri="http://www.w3.org/2001/XMLSchema"/>
     <ds:schemaRef ds:uri="http://www.zhaw.ch/AccessibilityAddIn"/>
   </ds:schemaRefs>
 </ds:datastoreItem>
+</file>
+
+<file path=customXml/itemProps2.xml><?xml version="1.0" encoding="utf-8"?>
+<ds:datastoreItem xmlns:ds="http://schemas.openxmlformats.org/officeDocument/2006/customXml" ds:itemID="{82881D81-B07A-40A3-826B-39C868CF3A6B}">
+  <ds:schemaRefs>
+    <ds:schemaRef ds:uri="http://schemas.openxmlformats.org/officeDocument/2006/bibliography"/>
+  </ds:schemaRefs>
+</ds:datastoreItem>
 </file>
</xml_diff>